<commit_message>
docs(office): rewrite the TDP copy and rebuild the deck layout
The deck was a list of one-line claims with no setup, so a reader landing mid-deck had no context. Every slide now opens with a takeaway, carries three or four labelled cards, and closes with a callout. The narrative adds what is already built and folds market into impact.

The proposal gets dot-leader contents with page numbers, consistent table widths, right-aligned amounts, and no orphaned headings. The budget workbook is rebuilt as clean tables with a readable summary sheet.

The specification is corrected to the shipped firmware: ESP8266 on M1, weights 40/25/25/10 with level unscored, three score bands, and a BOM that matches the grant budget.
</commit_message>
<xml_diff>
--- a/docs/office/TankGuard_Project_Proposal.docx
+++ b/docs/office/TankGuard_Project_Proposal.docx
@@ -4,7 +4,7 @@
   <w:body>
     <w:p>
       <w:pPr>
-        <w:spacing w:after="80"/>
+        <w:spacing w:after="80" w:before="3800"/>
         <w:jc w:val="center"/>
       </w:pPr>
       <w:r>
@@ -40,7 +40,7 @@
           <w:color w:val="1F4E79"/>
           <w:sz w:val="30"/>
         </w:rPr>
-        <w:t>TIH — IoT Technology Development Program 2026</w:t>
+        <w:t>TIH IoT Technology Development Program 2026</w:t>
       </w:r>
     </w:p>
     <w:p>
@@ -54,7 +54,7 @@
           <w:color w:val="1F4E79"/>
           <w:sz w:val="32"/>
         </w:rPr>
-        <w:t>TankGuard — self-powered IoT water-tank monitoring, pump control and automated sludge cleaning</w:t>
+        <w:t>TankGuard: self-powered monitoring, pump control and sludge cleaning for water tanks</w:t>
       </w:r>
     </w:p>
     <w:p>
@@ -94,7 +94,7 @@
           <w:b w:val="0"/>
           <w:sz w:val="22"/>
         </w:rPr>
-        <w:t>Nuke Labs — Industry Partner</w:t>
+        <w:t>Nuke Labs (industry partner)</w:t>
       </w:r>
     </w:p>
     <w:p>
@@ -107,7 +107,7 @@
           <w:b w:val="0"/>
           <w:sz w:val="21"/>
         </w:rPr>
-        <w:t>Theme: TIH — IoT Technology Development Program 2026</w:t>
+        <w:t>Theme: TIH IoT Technology Development Program 2026</w:t>
       </w:r>
     </w:p>
     <w:p>
@@ -131,6 +131,7 @@
     <w:p>
       <w:pPr>
         <w:pStyle w:val="Heading1"/>
+        <w:keepNext/>
         <w:numPr>
           <w:ilvl w:val="0"/>
           <w:numId w:val="0"/>
@@ -148,146 +149,194 @@
     </w:p>
     <w:p>
       <w:pPr>
-        <w:spacing w:after="40"/>
+        <w:tabs>
+          <w:tab w:pos="8800" w:val="right" w:leader="dot"/>
+        </w:tabs>
+        <w:spacing w:after="80"/>
       </w:pPr>
       <w:r>
         <w:rPr>
-          <w:b w:val="0"/>
           <w:sz w:val="22"/>
         </w:rPr>
         <w:t>1  Cover Sheet</w:t>
+        <w:tab/>
+        <w:t>3</w:t>
       </w:r>
     </w:p>
     <w:p>
       <w:pPr>
-        <w:spacing w:after="40"/>
+        <w:tabs>
+          <w:tab w:pos="8800" w:val="right" w:leader="dot"/>
+        </w:tabs>
+        <w:spacing w:after="80"/>
       </w:pPr>
       <w:r>
         <w:rPr>
-          <w:b w:val="0"/>
           <w:sz w:val="22"/>
         </w:rPr>
         <w:t>2  Executive Summary</w:t>
+        <w:tab/>
+        <w:t>3</w:t>
       </w:r>
     </w:p>
     <w:p>
       <w:pPr>
-        <w:spacing w:after="40"/>
+        <w:tabs>
+          <w:tab w:pos="8800" w:val="right" w:leader="dot"/>
+        </w:tabs>
+        <w:spacing w:after="80"/>
       </w:pPr>
       <w:r>
         <w:rPr>
-          <w:b w:val="0"/>
           <w:sz w:val="22"/>
         </w:rPr>
         <w:t>3  Background</w:t>
+        <w:tab/>
+        <w:t>3</w:t>
       </w:r>
     </w:p>
     <w:p>
       <w:pPr>
-        <w:spacing w:after="40"/>
+        <w:tabs>
+          <w:tab w:pos="8800" w:val="right" w:leader="dot"/>
+        </w:tabs>
+        <w:spacing w:after="80"/>
       </w:pPr>
       <w:r>
         <w:rPr>
-          <w:b w:val="0"/>
           <w:sz w:val="22"/>
         </w:rPr>
         <w:t xml:space="preserve">     3.1  History</w:t>
+        <w:tab/>
+        <w:t>3</w:t>
       </w:r>
     </w:p>
     <w:p>
       <w:pPr>
-        <w:spacing w:after="40"/>
+        <w:tabs>
+          <w:tab w:pos="8800" w:val="right" w:leader="dot"/>
+        </w:tabs>
+        <w:spacing w:after="80"/>
       </w:pPr>
       <w:r>
         <w:rPr>
-          <w:b w:val="0"/>
           <w:sz w:val="22"/>
         </w:rPr>
         <w:t xml:space="preserve">     3.2  Statement of the problem</w:t>
+        <w:tab/>
+        <w:t>4</w:t>
       </w:r>
     </w:p>
     <w:p>
       <w:pPr>
-        <w:spacing w:after="40"/>
+        <w:tabs>
+          <w:tab w:pos="8800" w:val="right" w:leader="dot"/>
+        </w:tabs>
+        <w:spacing w:after="80"/>
       </w:pPr>
       <w:r>
         <w:rPr>
-          <w:b w:val="0"/>
           <w:sz w:val="22"/>
         </w:rPr>
         <w:t xml:space="preserve">     3.3  Objectives</w:t>
+        <w:tab/>
+        <w:t>4</w:t>
       </w:r>
     </w:p>
     <w:p>
       <w:pPr>
-        <w:spacing w:after="40"/>
+        <w:tabs>
+          <w:tab w:pos="8800" w:val="right" w:leader="dot"/>
+        </w:tabs>
+        <w:spacing w:after="80"/>
       </w:pPr>
       <w:r>
         <w:rPr>
-          <w:b w:val="0"/>
           <w:sz w:val="22"/>
         </w:rPr>
         <w:t xml:space="preserve">     3.4  Deliverables</w:t>
+        <w:tab/>
+        <w:t>4</w:t>
       </w:r>
     </w:p>
     <w:p>
       <w:pPr>
-        <w:spacing w:after="40"/>
+        <w:tabs>
+          <w:tab w:pos="8800" w:val="right" w:leader="dot"/>
+        </w:tabs>
+        <w:spacing w:after="80"/>
       </w:pPr>
       <w:r>
         <w:rPr>
-          <w:b w:val="0"/>
           <w:sz w:val="22"/>
         </w:rPr>
         <w:t xml:space="preserve">     3.5  Project plan with major milestones</w:t>
+        <w:tab/>
+        <w:t>5</w:t>
       </w:r>
     </w:p>
     <w:p>
       <w:pPr>
-        <w:spacing w:after="40"/>
+        <w:tabs>
+          <w:tab w:pos="8800" w:val="right" w:leader="dot"/>
+        </w:tabs>
+        <w:spacing w:after="80"/>
       </w:pPr>
       <w:r>
         <w:rPr>
-          <w:b w:val="0"/>
           <w:sz w:val="22"/>
         </w:rPr>
         <w:t xml:space="preserve">     3.6  Resources and budget</w:t>
+        <w:tab/>
+        <w:t>5</w:t>
       </w:r>
     </w:p>
     <w:p>
       <w:pPr>
-        <w:spacing w:after="40"/>
+        <w:tabs>
+          <w:tab w:pos="8800" w:val="right" w:leader="dot"/>
+        </w:tabs>
+        <w:spacing w:after="80"/>
       </w:pPr>
       <w:r>
         <w:rPr>
-          <w:b w:val="0"/>
           <w:sz w:val="22"/>
         </w:rPr>
         <w:t xml:space="preserve">     3.7  Category of new technology/product</w:t>
+        <w:tab/>
+        <w:t>6</w:t>
       </w:r>
     </w:p>
     <w:p>
       <w:pPr>
-        <w:spacing w:after="40"/>
+        <w:tabs>
+          <w:tab w:pos="8800" w:val="right" w:leader="dot"/>
+        </w:tabs>
+        <w:spacing w:after="80"/>
       </w:pPr>
       <w:r>
         <w:rPr>
-          <w:b w:val="0"/>
           <w:sz w:val="22"/>
         </w:rPr>
         <w:t>4  Appendix</w:t>
+        <w:tab/>
+        <w:t>6</w:t>
       </w:r>
     </w:p>
     <w:p>
       <w:pPr>
-        <w:spacing w:after="40"/>
+        <w:tabs>
+          <w:tab w:pos="8800" w:val="right" w:leader="dot"/>
+        </w:tabs>
+        <w:spacing w:after="80"/>
       </w:pPr>
       <w:r>
         <w:rPr>
-          <w:b w:val="0"/>
           <w:sz w:val="22"/>
         </w:rPr>
         <w:t xml:space="preserve">     4.1  Supporting documentation</w:t>
+        <w:tab/>
+        <w:t>6</w:t>
       </w:r>
     </w:p>
     <w:p>
@@ -298,6 +347,7 @@
     <w:p>
       <w:pPr>
         <w:pStyle w:val="Heading1"/>
+        <w:keepNext/>
         <w:numPr>
           <w:ilvl w:val="0"/>
           <w:numId w:val="0"/>
@@ -325,6 +375,9 @@
         <w:gridCol w:w="4819"/>
       </w:tblGrid>
       <w:tr>
+        <w:trPr>
+          <w:tblHeader w:val="true"/>
+        </w:trPr>
         <w:tc>
           <w:tcPr>
             <w:tcW w:type="dxa" w:w="3000"/>
@@ -387,7 +440,7 @@
               <w:rPr>
                 <w:sz w:val="19"/>
               </w:rPr>
-              <w:t>TankGuard — self-powered IoT water-tank monitoring, pump control and automated sludge cleaning</w:t>
+              <w:t>TankGuard: self-powered monitoring, pump control and sludge cleaning for water tanks</w:t>
             </w:r>
           </w:p>
         </w:tc>
@@ -483,38 +536,7 @@
               <w:rPr>
                 <w:sz w:val="19"/>
               </w:rPr>
-              <w:t>Nuke Labs — Industry Partner</w:t>
-            </w:r>
-          </w:p>
-        </w:tc>
-      </w:tr>
-      <w:tr>
-        <w:tc>
-          <w:tcPr>
-            <w:tcW w:type="dxa" w:w="3000"/>
-            <w:shd w:val="clear" w:color="auto" w:fill="FFFFFF"/>
-          </w:tcPr>
-          <w:p>
-            <w:r/>
-            <w:r>
-              <w:rPr>
-                <w:sz w:val="19"/>
-              </w:rPr>
-              <w:t>Email</w:t>
-            </w:r>
-          </w:p>
-        </w:tc>
-        <w:tc>
-          <w:tcPr>
-            <w:tcW w:type="dxa" w:w="6000"/>
-            <w:shd w:val="clear" w:color="auto" w:fill="FFFFFF"/>
-          </w:tcPr>
-          <w:p>
-            <w:r/>
-            <w:r>
-              <w:rPr>
-                <w:sz w:val="19"/>
-              </w:rPr>
+              <w:t>Nuke Labs (industry partner)</w:t>
             </w:r>
           </w:p>
         </w:tc>
@@ -546,7 +568,7 @@
               <w:rPr>
                 <w:sz w:val="19"/>
               </w:rPr>
-              <w:t>—</w:t>
+              <w:t>None</w:t>
             </w:r>
           </w:p>
         </w:tc>
@@ -610,7 +632,7 @@
               <w:rPr>
                 <w:sz w:val="19"/>
               </w:rPr>
-              <w:t>TIH — IoT Technology Development Program 2026</w:t>
+              <w:t>TIH IoT Technology Development Program 2026</w:t>
             </w:r>
           </w:p>
         </w:tc>
@@ -652,6 +674,7 @@
     <w:p>
       <w:pPr>
         <w:pStyle w:val="Heading1"/>
+        <w:keepNext/>
         <w:numPr>
           <w:ilvl w:val="0"/>
           <w:numId w:val="0"/>
@@ -676,7 +699,7 @@
           <w:b w:val="0"/>
           <w:sz w:val="22"/>
         </w:rPr>
-        <w:t>TankGuard is a self-powered Internet of Things (IoT) system for domestic and institutional water storage tanks. It measures water quality in the tank, scores it, controls the household pump safely, and cleans the settled sludge layer with a small robotic arm — all on the local network, with no cloud, subscription or account.</w:t>
+        <w:t>TankGuard is a self-powered monitoring and cleaning system for water storage tanks in homes and institutions. It measures water quality in the tank, reports one score, controls the household pump, and cleans the sludge that settles on the floor. All of it runs on the local network, with no cloud service, subscription or account.</w:t>
       </w:r>
     </w:p>
     <w:p>
@@ -688,7 +711,7 @@
           <w:b w:val="0"/>
           <w:sz w:val="22"/>
         </w:rPr>
-        <w:t>The system is three units on one local network. M1 sits on the tank lid and reads turbidity, TDS, pH, temperature and level through submerged probes, computes a weighted 0-100 TankScore at the edge, and serves the dashboard itself from its own flash. H1 sits next to the pump switch, shows the score on a 1.8-inch colour display, and drives the pump through an isolated relay and contactor with automatic level control and a manual override. C1 is the cleaning arm: a two-link 20 cm + 20 cm mechanism that sweeps the tank floor in three concentric passes while a ring brush loosens the sludge and a submersible pump draws it out through the centre of the head.</w:t>
+        <w:t>The system has three units. M1 sits on the tank lid and reads turbidity, TDS, pH, temperature and water level through submerged probes. It computes a weighted score between 0 and 100 and serves the dashboard from its own flash memory. H1 sits next to the pump switch, shows the score on a 1.8 inch colour display, and drives the pump through an isolated relay and contactor. C1 is the cleaning arm: two rigid links of 20 cm each, a ring brush at the tip, and a submersible pump that draws the loosened sludge through the centre of the head.</w:t>
       </w:r>
     </w:p>
     <w:p>
@@ -700,7 +723,7 @@
           <w:b w:val="0"/>
           <w:sz w:val="22"/>
         </w:rPr>
-        <w:t>Water safety management still relies on manual sampling and calendar-based cleaning. Tanks degrade silently: disinfectant residual dissipates within 24-48 hours, particles settle into a sludge layer at the floor, biofilm forms on the walls, and algae bloom in warm water. By the time the water smells or looks wrong it is already unsafe, and the only remedy is a full drain and manual scrub that wastes the entire stored volume.</w:t>
+        <w:t>Tanks degrade without warning. Disinfectant residual is gone within 24 to 48 hours of filling. Particles settle into a sludge layer at the floor, biofilm forms on the walls, and algae grow faster in warm water. The water is unsafe before it smells or looks wrong. The usual remedy is a full drain and a manual scrub, which discards the whole stored volume.</w:t>
       </w:r>
     </w:p>
     <w:p>
@@ -712,7 +735,7 @@
           <w:b w:val="0"/>
           <w:sz w:val="22"/>
         </w:rPr>
-        <w:t>TankGuard closes that loop at the edge: sense, score, act, and verify. The cleaning arm covers 90% of the tank floor per cycle; the remaining 7.8% is a 2 cm ring at the wall that the mechanism cannot reach, and the design record states it rather than hiding it. The dashboard reports what happened, not what the vendor wishes had happened.</w:t>
+        <w:t>TankGuard measures, decides and cleans at the edge. One cleaning cycle covers 90 percent of the floor. A 2 cm ring at the wall stays out of reach, and the design record states it. The dashboard reports the data source and the coverage limit, so the owner knows what was measured and what was cleaned.</w:t>
       </w:r>
     </w:p>
     <w:p>
@@ -724,12 +747,13 @@
           <w:b w:val="0"/>
           <w:sz w:val="22"/>
         </w:rPr>
-        <w:t>Deliverables: (1) a working TankGuard prototype (M1 + H1); (2) the cleaning arm C1 with its planner and controller; (3) the web dashboard, served by the tank unit itself; (4) validation at TRL 6+ with an industry partner, including field data from at least three installations.</w:t>
+        <w:t>The project delivers a working prototype of M1 and H1, the C1 cleaning arm with its planner and controller, the dashboard served by the tank unit, and field validation at TRL 6 or above with an industry partner.</w:t>
       </w:r>
     </w:p>
     <w:p>
       <w:pPr>
         <w:pStyle w:val="Heading1"/>
+        <w:keepNext/>
         <w:numPr>
           <w:ilvl w:val="0"/>
           <w:numId w:val="0"/>
@@ -748,6 +772,7 @@
     <w:p>
       <w:pPr>
         <w:pStyle w:val="Heading2"/>
+        <w:keepNext/>
         <w:numPr>
           <w:ilvl w:val="0"/>
           <w:numId w:val="0"/>
@@ -772,7 +797,7 @@
           <w:b w:val="0"/>
           <w:sz w:val="22"/>
         </w:rPr>
-        <w:t>TankGuard began as an in-tank water-quality monitor: five probes, an edge-computed score, and a dashboard served by the device itself. The first build proved that a low-cost ESP8266 can carry the whole stack — sensing, scoring, a web UI and a local Wi-Fi link — without a cloud path.</w:t>
+        <w:t>TankGuard started as a water-quality monitor. Five probes fed an edge-computed score, and the device served its own dashboard over Wi-Fi. The first build showed that an ESP8266 can carry the whole stack without a cloud service.</w:t>
       </w:r>
     </w:p>
     <w:p>
@@ -784,7 +809,7 @@
           <w:b w:val="0"/>
           <w:sz w:val="22"/>
         </w:rPr>
-        <w:t>Field work exposed the real failure mode. Measurement alone does not fix a tank: the sludge layer at the floor keeps feeding turbidity and biofilm, and the household's only remedy is a full drain and manual scrub. The product therefore moved from monitoring to care: a home unit that runs the pump safely, and a cleaning arm that removes the sludge layer without emptying the tank.</w:t>
+        <w:t>Field trials exposed the real failure mode. Measurement alone does not clean a tank. The sludge layer keeps feeding turbidity and biofilm, and the household still has to drain and scrub the tank by hand. The product therefore moved from monitoring to care: a home unit that runs the pump safely, and an arm that removes the sludge without emptying the tank.</w:t>
       </w:r>
     </w:p>
     <w:p>
@@ -796,12 +821,13 @@
           <w:b w:val="0"/>
           <w:sz w:val="22"/>
         </w:rPr>
-        <w:t>The current design keeps every earlier decision that still holds — the five probes, the TankScore weights, the local-only architecture — and replaces the abandoned drain-and-flush mechanism with the robotic cleaning arm described here.</w:t>
+        <w:t>The current design keeps the five probes, the score weights and the local-only architecture. It replaces the abandoned drain-and-flush mechanism with the cleaning arm described here.</w:t>
       </w:r>
     </w:p>
     <w:p>
       <w:pPr>
         <w:pStyle w:val="Heading2"/>
+        <w:keepNext/>
         <w:numPr>
           <w:ilvl w:val="0"/>
           <w:numId w:val="0"/>
@@ -826,7 +852,7 @@
           <w:b w:val="0"/>
           <w:sz w:val="22"/>
         </w:rPr>
-        <w:t>Storage tanks degrade silently. Disinfectant residual dissipates within 24-48 hours of filling; suspended particles settle into a sludge layer at the floor; biofilm forms on internal surfaces; algae proliferate in warm conditions. By the time degradation is detected by smell, taste or sight, the water is already unsafe.</w:t>
+        <w:t>Storage tanks degrade silently. Residual chlorine disappears within 24 to 48 hours. Suspended solids settle into a sludge layer. Biofilm forms on internal surfaces, and algae grow in warm water. By the time the problem is visible, the water is already unsafe.</w:t>
       </w:r>
     </w:p>
     <w:p>
@@ -838,7 +864,7 @@
           <w:b w:val="0"/>
           <w:sz w:val="22"/>
         </w:rPr>
-        <w:t>Existing options either monitor without acting, or clean by draining and scrubbing the entire tank, which wastes the whole stored volume and needs manual labour. No affordable product closes the loop: measure, decide, clean selectively, and show whether the cleaning worked.</w:t>
+        <w:t>Current options either monitor without acting or clean by draining the whole tank. Monitoring tells the owner there is a problem and leaves the work to them. A full drain wastes the stored water and needs manual labour.</w:t>
       </w:r>
     </w:p>
     <w:p>
@@ -850,12 +876,13 @@
           <w:b w:val="0"/>
           <w:sz w:val="22"/>
         </w:rPr>
-        <w:t>The problem is worst where it matters most: schools, hospitals and apartment buildings store large volumes, clean on a calendar rather than on evidence, and have no way to tell whether the last cleaning actually helped.</w:t>
+        <w:t>The gap is largest where it matters most. Schools, hospitals and apartment buildings store large volumes, clean to a fixed calendar, and cannot tell whether the last clean helped.</w:t>
       </w:r>
     </w:p>
     <w:p>
       <w:pPr>
         <w:pStyle w:val="Heading2"/>
+        <w:keepNext/>
         <w:numPr>
           <w:ilvl w:val="0"/>
           <w:numId w:val="0"/>
@@ -880,7 +907,7 @@
           <w:b w:val="0"/>
           <w:sz w:val="22"/>
         </w:rPr>
-        <w:t>Objective 1 — Measure and score water quality at the edge. Five probes (turbidity, TDS, pH, temperature, level) digitised through an ADS1115 and fused into a weighted TankScore (turbidity 40%, TDS 25%, pH 25%, temperature 10%), with the same bands the display and the dashboard use (&gt;=70 good, &gt;=40 watch, &lt;40 needs attention). Acceptance: score repeatable within +/-2 points across ten consecutive samples in still water.</w:t>
+        <w:t>Objective 1: measure and score water quality at the edge. Five probes (turbidity, TDS, pH, temperature, level) are digitised through an ADS1115 and fused into a weighted score (turbidity 40 percent, TDS 25, pH 25, temperature 10). Acceptance: the score repeats within 2 points across ten consecutive samples in still water.</w:t>
       </w:r>
     </w:p>
     <w:p>
@@ -892,7 +919,7 @@
           <w:b w:val="0"/>
           <w:sz w:val="22"/>
         </w:rPr>
-        <w:t>Objective 2 — Make the result readable without a phone. H1 shows TankScore, level, the four readings, pump state and link health on a 1.8-inch TFT, and controls the pump in AUTO (on below the low-level setpoint, off above the high) with a manual override that times out safely.</w:t>
+        <w:t>Objective 2: make the result readable without a phone. H1 shows the score, level, the four readings, pump state and link health on a 1.8 inch display. It controls the pump in automatic mode (on below the low-level setpoint, off above the high) with a manual override that releases safely.</w:t>
       </w:r>
     </w:p>
     <w:p>
@@ -904,7 +931,7 @@
           <w:b w:val="0"/>
           <w:sz w:val="22"/>
         </w:rPr>
-        <w:t>Objective 3 — Clean the tank floor without draining it. C1 sweeps three concentric rings at 8.0 / 23.7 / 39.4 cm with a 16 cm ring brush and a central suction intake, covering 90% of the floor per cycle, and parks in a defined rest pose at both ends of every cycle.</w:t>
+        <w:t>Objective 3: clean the tank floor without draining it. C1 sweeps three concentric rings at 8.0, 23.7 and 39.4 cm with a 16 cm ring brush and a central suction intake, covering 90 percent of the floor per cycle, and parks in a fixed rest pose at both ends of the cycle.</w:t>
       </w:r>
     </w:p>
     <w:p>
@@ -916,12 +943,13 @@
           <w:b w:val="0"/>
           <w:sz w:val="22"/>
         </w:rPr>
-        <w:t>Objective 4 — Prove it in the field. Twelve months to TRL 6+: three installations, 90 days of continuous operation, and a published measurement of score accuracy, cleaning coverage and water saved against a full drain.</w:t>
+        <w:t>Objective 4: prove it in the field. Twelve months to TRL 6 or above, with three installations, 90 days of continuous operation, and a published measurement of score accuracy, cleaning coverage and water saved against a full drain.</w:t>
       </w:r>
     </w:p>
     <w:p>
       <w:pPr>
         <w:pStyle w:val="Heading2"/>
+        <w:keepNext/>
         <w:numPr>
           <w:ilvl w:val="0"/>
           <w:numId w:val="0"/>
@@ -946,7 +974,7 @@
           <w:b w:val="0"/>
           <w:sz w:val="22"/>
         </w:rPr>
-        <w:t>D1 — M1 monitor: ESP8266 unit on the tank lid with five calibrated probes, edge TankScore, and the web dashboard served from LittleFS.</w:t>
+        <w:t>D1. M1 monitor: an ESP8266 unit on the tank lid with five calibrated probes, an edge score, and the web dashboard served from flash.</w:t>
       </w:r>
     </w:p>
     <w:p>
@@ -958,7 +986,7 @@
           <w:b w:val="0"/>
           <w:sz w:val="22"/>
         </w:rPr>
-        <w:t>D2 — H1 home unit: ESP8266 with a 1.8-inch TFT, automatic pump control through an isolated relay and contactor, and a manual override.</w:t>
+        <w:t>D2. H1 home unit: an ESP8266 with a 1.8 inch display, automatic pump control through an isolated relay and contactor, and a manual override.</w:t>
       </w:r>
     </w:p>
     <w:p>
@@ -970,7 +998,7 @@
           <w:b w:val="0"/>
           <w:sz w:val="22"/>
         </w:rPr>
-        <w:t>D3 — C1 cleaning arm: ESP32 controller, two-link arm, ring brush head with suction, planner and path executor, with the coverage analysis that states its limits.</w:t>
+        <w:t>D3. C1 cleaning arm: an ESP32 controller, a two-link arm, a ring brush head with suction, a path planner and an executor, with the coverage analysis that states its limits.</w:t>
       </w:r>
     </w:p>
     <w:p>
@@ -982,12 +1010,14 @@
           <w:b w:val="0"/>
           <w:sz w:val="22"/>
         </w:rPr>
-        <w:t>D4 — Field evidence: three installations, 90 days of data, and a TRL 6+ evidence pack including score accuracy and cleaning coverage.</w:t>
+        <w:t>D4. Field evidence: three installations, 90 days of data, and a TRL 6 evidence pack covering score accuracy and cleaning coverage.</w:t>
       </w:r>
     </w:p>
     <w:p>
       <w:pPr>
         <w:pStyle w:val="Heading2"/>
+        <w:keepNext/>
+        <w:pageBreakBefore/>
         <w:numPr>
           <w:ilvl w:val="0"/>
           <w:numId w:val="0"/>
@@ -1012,7 +1042,7 @@
           <w:b w:val="0"/>
           <w:sz w:val="22"/>
         </w:rPr>
-        <w:t>Twelve-month plan from T0, with a gate at every milestone.</w:t>
+        <w:t>Twelve months from T0, with a demonstration at every gate.</w:t>
       </w:r>
     </w:p>
     <w:tbl>
@@ -1029,6 +1059,9 @@
         <w:gridCol w:w="2410"/>
       </w:tblGrid>
       <w:tr>
+        <w:trPr>
+          <w:tblHeader w:val="true"/>
+        </w:trPr>
         <w:tc>
           <w:tcPr>
             <w:tcW w:type="dxa" w:w="480"/>
@@ -1093,7 +1126,7 @@
                 <w:color w:val="FFFFFF"/>
                 <w:sz w:val="19"/>
               </w:rPr>
-              <w:t>What is delivered</w:t>
+              <w:t>Delivered at the gate</w:t>
             </w:r>
           </w:p>
         </w:tc>
@@ -1155,7 +1188,7 @@
               <w:rPr>
                 <w:sz w:val="19"/>
               </w:rPr>
-              <w:t>M1 assembled and calibrated; TankScore validated; dashboard served from flash.</w:t>
+              <w:t>M1 assembled and calibrated. Score validated against reference instruments. Dashboard served from flash.</w:t>
             </w:r>
           </w:p>
         </w:tc>
@@ -1217,7 +1250,7 @@
               <w:rPr>
                 <w:sz w:val="19"/>
               </w:rPr>
-              <w:t>H1 installed with pump control; dashboard, session log and device table complete.</w:t>
+              <w:t>H1 installed with pump control. Dashboard, session log and device table complete.</w:t>
             </w:r>
           </w:p>
         </w:tc>
@@ -1279,7 +1312,7 @@
               <w:rPr>
                 <w:sz w:val="19"/>
               </w:rPr>
-              <w:t>C1 built; three-ring cycle executed; coverage and repeatability measured.</w:t>
+              <w:t>C1 built. Three-ring cycle executed. Coverage and repeatability measured.</w:t>
             </w:r>
           </w:p>
         </w:tc>
@@ -1341,7 +1374,7 @@
               <w:rPr>
                 <w:sz w:val="19"/>
               </w:rPr>
-              <w:t>Three installations, 90 days of data, TRL 6+ evidence pack.</w:t>
+              <w:t>Three installations, 90 days of data, TRL 6 evidence pack.</w:t>
             </w:r>
           </w:p>
         </w:tc>
@@ -1351,6 +1384,7 @@
     <w:p>
       <w:pPr>
         <w:pStyle w:val="Heading2"/>
+        <w:keepNext/>
         <w:numPr>
           <w:ilvl w:val="0"/>
           <w:numId w:val="0"/>
@@ -1378,9 +1412,12 @@
         <w:gridCol w:w="4819"/>
       </w:tblGrid>
       <w:tr>
+        <w:trPr>
+          <w:tblHeader w:val="true"/>
+        </w:trPr>
         <w:tc>
           <w:tcPr>
-            <w:tcW w:type="dxa" w:w="4800"/>
+            <w:tcW w:type="dxa" w:w="6000"/>
             <w:shd w:val="clear" w:color="auto" w:fill="1F4E79"/>
           </w:tcPr>
           <w:p>
@@ -1397,7 +1434,7 @@
         </w:tc>
         <w:tc>
           <w:tcPr>
-            <w:tcW w:type="dxa" w:w="2200"/>
+            <w:tcW w:type="dxa" w:w="3080"/>
             <w:shd w:val="clear" w:color="auto" w:fill="1F4E79"/>
           </w:tcPr>
           <w:p>
@@ -1416,7 +1453,7 @@
       <w:tr>
         <w:tc>
           <w:tcPr>
-            <w:tcW w:type="dxa" w:w="4800"/>
+            <w:tcW w:type="dxa" w:w="6000"/>
             <w:shd w:val="clear" w:color="auto" w:fill="FFFFFF"/>
           </w:tcPr>
           <w:p>
@@ -1431,10 +1468,13 @@
         </w:tc>
         <w:tc>
           <w:tcPr>
-            <w:tcW w:type="dxa" w:w="2200"/>
+            <w:tcW w:type="dxa" w:w="3080"/>
             <w:shd w:val="clear" w:color="auto" w:fill="FFFFFF"/>
           </w:tcPr>
           <w:p>
+            <w:pPr>
+              <w:jc w:val="right"/>
+            </w:pPr>
             <w:r/>
             <w:r>
               <w:rPr>
@@ -1448,7 +1488,7 @@
       <w:tr>
         <w:tc>
           <w:tcPr>
-            <w:tcW w:type="dxa" w:w="4800"/>
+            <w:tcW w:type="dxa" w:w="6000"/>
             <w:shd w:val="clear" w:color="auto" w:fill="FFFFFF"/>
           </w:tcPr>
           <w:p>
@@ -1463,10 +1503,13 @@
         </w:tc>
         <w:tc>
           <w:tcPr>
-            <w:tcW w:type="dxa" w:w="2200"/>
+            <w:tcW w:type="dxa" w:w="3080"/>
             <w:shd w:val="clear" w:color="auto" w:fill="FFFFFF"/>
           </w:tcPr>
           <w:p>
+            <w:pPr>
+              <w:jc w:val="right"/>
+            </w:pPr>
             <w:r/>
             <w:r>
               <w:rPr>
@@ -1480,7 +1523,7 @@
       <w:tr>
         <w:tc>
           <w:tcPr>
-            <w:tcW w:type="dxa" w:w="4800"/>
+            <w:tcW w:type="dxa" w:w="6000"/>
             <w:shd w:val="clear" w:color="auto" w:fill="FFFFFF"/>
           </w:tcPr>
           <w:p>
@@ -1495,10 +1538,13 @@
         </w:tc>
         <w:tc>
           <w:tcPr>
-            <w:tcW w:type="dxa" w:w="2200"/>
+            <w:tcW w:type="dxa" w:w="3080"/>
             <w:shd w:val="clear" w:color="auto" w:fill="FFFFFF"/>
           </w:tcPr>
           <w:p>
+            <w:pPr>
+              <w:jc w:val="right"/>
+            </w:pPr>
             <w:r/>
             <w:r>
               <w:rPr>
@@ -1512,7 +1558,7 @@
       <w:tr>
         <w:tc>
           <w:tcPr>
-            <w:tcW w:type="dxa" w:w="4800"/>
+            <w:tcW w:type="dxa" w:w="6000"/>
             <w:shd w:val="clear" w:color="auto" w:fill="FFFFFF"/>
           </w:tcPr>
           <w:p>
@@ -1527,10 +1573,13 @@
         </w:tc>
         <w:tc>
           <w:tcPr>
-            <w:tcW w:type="dxa" w:w="2200"/>
+            <w:tcW w:type="dxa" w:w="3080"/>
             <w:shd w:val="clear" w:color="auto" w:fill="FFFFFF"/>
           </w:tcPr>
           <w:p>
+            <w:pPr>
+              <w:jc w:val="right"/>
+            </w:pPr>
             <w:r/>
             <w:r>
               <w:rPr>
@@ -1544,7 +1593,7 @@
       <w:tr>
         <w:tc>
           <w:tcPr>
-            <w:tcW w:type="dxa" w:w="4800"/>
+            <w:tcW w:type="dxa" w:w="6000"/>
             <w:shd w:val="clear" w:color="auto" w:fill="FFFFFF"/>
           </w:tcPr>
           <w:p>
@@ -1559,10 +1608,13 @@
         </w:tc>
         <w:tc>
           <w:tcPr>
-            <w:tcW w:type="dxa" w:w="2200"/>
+            <w:tcW w:type="dxa" w:w="3080"/>
             <w:shd w:val="clear" w:color="auto" w:fill="FFFFFF"/>
           </w:tcPr>
           <w:p>
+            <w:pPr>
+              <w:jc w:val="right"/>
+            </w:pPr>
             <w:r/>
             <w:r>
               <w:rPr>
@@ -1576,7 +1628,7 @@
       <w:tr>
         <w:tc>
           <w:tcPr>
-            <w:tcW w:type="dxa" w:w="4800"/>
+            <w:tcW w:type="dxa" w:w="6000"/>
             <w:shd w:val="clear" w:color="auto" w:fill="FFFFFF"/>
           </w:tcPr>
           <w:p>
@@ -1591,10 +1643,13 @@
         </w:tc>
         <w:tc>
           <w:tcPr>
-            <w:tcW w:type="dxa" w:w="2200"/>
+            <w:tcW w:type="dxa" w:w="3080"/>
             <w:shd w:val="clear" w:color="auto" w:fill="FFFFFF"/>
           </w:tcPr>
           <w:p>
+            <w:pPr>
+              <w:jc w:val="right"/>
+            </w:pPr>
             <w:r/>
             <w:r>
               <w:rPr>
@@ -1608,7 +1663,7 @@
       <w:tr>
         <w:tc>
           <w:tcPr>
-            <w:tcW w:type="dxa" w:w="4800"/>
+            <w:tcW w:type="dxa" w:w="6000"/>
             <w:shd w:val="clear" w:color="auto" w:fill="FFFFFF"/>
           </w:tcPr>
           <w:p>
@@ -1623,10 +1678,13 @@
         </w:tc>
         <w:tc>
           <w:tcPr>
-            <w:tcW w:type="dxa" w:w="2200"/>
+            <w:tcW w:type="dxa" w:w="3080"/>
             <w:shd w:val="clear" w:color="auto" w:fill="FFFFFF"/>
           </w:tcPr>
           <w:p>
+            <w:pPr>
+              <w:jc w:val="right"/>
+            </w:pPr>
             <w:r/>
             <w:r>
               <w:rPr>
@@ -1640,7 +1698,7 @@
       <w:tr>
         <w:tc>
           <w:tcPr>
-            <w:tcW w:type="dxa" w:w="4800"/>
+            <w:tcW w:type="dxa" w:w="6000"/>
             <w:shd w:val="clear" w:color="auto" w:fill="FFFFFF"/>
           </w:tcPr>
           <w:p>
@@ -1655,10 +1713,13 @@
         </w:tc>
         <w:tc>
           <w:tcPr>
-            <w:tcW w:type="dxa" w:w="2200"/>
+            <w:tcW w:type="dxa" w:w="3080"/>
             <w:shd w:val="clear" w:color="auto" w:fill="FFFFFF"/>
           </w:tcPr>
           <w:p>
+            <w:pPr>
+              <w:jc w:val="right"/>
+            </w:pPr>
             <w:r/>
             <w:r>
               <w:rPr>
@@ -1672,7 +1733,7 @@
       <w:tr>
         <w:tc>
           <w:tcPr>
-            <w:tcW w:type="dxa" w:w="4800"/>
+            <w:tcW w:type="dxa" w:w="6000"/>
             <w:shd w:val="clear" w:color="auto" w:fill="FFFFFF"/>
           </w:tcPr>
           <w:p>
@@ -1687,10 +1748,13 @@
         </w:tc>
         <w:tc>
           <w:tcPr>
-            <w:tcW w:type="dxa" w:w="2200"/>
+            <w:tcW w:type="dxa" w:w="3080"/>
             <w:shd w:val="clear" w:color="auto" w:fill="FFFFFF"/>
           </w:tcPr>
           <w:p>
+            <w:pPr>
+              <w:jc w:val="right"/>
+            </w:pPr>
             <w:r/>
             <w:r>
               <w:rPr>
@@ -1704,7 +1768,7 @@
       <w:tr>
         <w:tc>
           <w:tcPr>
-            <w:tcW w:type="dxa" w:w="4800"/>
+            <w:tcW w:type="dxa" w:w="6000"/>
             <w:shd w:val="clear" w:color="auto" w:fill="FFFFFF"/>
           </w:tcPr>
           <w:p>
@@ -1719,10 +1783,13 @@
         </w:tc>
         <w:tc>
           <w:tcPr>
-            <w:tcW w:type="dxa" w:w="2200"/>
+            <w:tcW w:type="dxa" w:w="3080"/>
             <w:shd w:val="clear" w:color="auto" w:fill="FFFFFF"/>
           </w:tcPr>
           <w:p>
+            <w:pPr>
+              <w:jc w:val="right"/>
+            </w:pPr>
             <w:r/>
             <w:r>
               <w:rPr>
@@ -1736,7 +1803,7 @@
       <w:tr>
         <w:tc>
           <w:tcPr>
-            <w:tcW w:type="dxa" w:w="4800"/>
+            <w:tcW w:type="dxa" w:w="6000"/>
             <w:shd w:val="clear" w:color="auto" w:fill="FFFFFF"/>
           </w:tcPr>
           <w:p>
@@ -1751,10 +1818,13 @@
         </w:tc>
         <w:tc>
           <w:tcPr>
-            <w:tcW w:type="dxa" w:w="2200"/>
+            <w:tcW w:type="dxa" w:w="3080"/>
             <w:shd w:val="clear" w:color="auto" w:fill="FFFFFF"/>
           </w:tcPr>
           <w:p>
+            <w:pPr>
+              <w:jc w:val="right"/>
+            </w:pPr>
             <w:r/>
             <w:r>
               <w:rPr>
@@ -1768,7 +1838,7 @@
       <w:tr>
         <w:tc>
           <w:tcPr>
-            <w:tcW w:type="dxa" w:w="4800"/>
+            <w:tcW w:type="dxa" w:w="6000"/>
             <w:shd w:val="clear" w:color="auto" w:fill="FFFFFF"/>
           </w:tcPr>
           <w:p>
@@ -1783,10 +1853,13 @@
         </w:tc>
         <w:tc>
           <w:tcPr>
-            <w:tcW w:type="dxa" w:w="2200"/>
+            <w:tcW w:type="dxa" w:w="3080"/>
             <w:shd w:val="clear" w:color="auto" w:fill="FFFFFF"/>
           </w:tcPr>
           <w:p>
+            <w:pPr>
+              <w:jc w:val="right"/>
+            </w:pPr>
             <w:r/>
             <w:r>
               <w:rPr>
@@ -1808,7 +1881,7 @@
           <w:b w:val="0"/>
           <w:sz w:val="20"/>
         </w:rPr>
-        <w:t>Equipment split (indicative): M1 monitor INR 6,500; H1 home unit INR 1,800; C1 cleaning arm INR 7,300 (two 12 V planetary gearmotors, ESP32, two H-bridges, submersible pump, brush head, enclosure).</w:t>
+        <w:t>Equipment split, indicative: M1 monitor INR 6,500; H1 home unit INR 1,800; C1 cleaning arm INR 7,300. The C1 figure covers two 12 V planetary gearmotors, an ESP32, two H-bridges, a submersible pump, the brush head and the enclosure.</w:t>
       </w:r>
     </w:p>
     <w:p>
@@ -1820,7 +1893,7 @@
           <w:b w:val="0"/>
           <w:sz w:val="20"/>
         </w:rPr>
-        <w:t>Contingency cannot exceed 5% of project value; overhead cannot exceed 20% of the sub total; the faculty fee is optional and capped at 20% of the total.</w:t>
+        <w:t>Contingency is capped at 5 percent of project value, overhead at 20 percent of the sub total, and the faculty fee at 20 percent of the total.</w:t>
       </w:r>
     </w:p>
     <w:p>
@@ -1832,18 +1905,14 @@
           <w:b w:val="0"/>
           <w:sz w:val="20"/>
         </w:rPr>
-        <w:t>Manpower, consumables, travel and miscellaneous heads will be aligned during the grant kickoff; equipment figures are vendor quotes pending confirmation.</w:t>
+        <w:t>Manpower, consumables, travel and miscellaneous heads will be agreed at the grant kickoff. Equipment figures are vendor quotes pending confirmation.</w:t>
       </w:r>
     </w:p>
     <w:p>
       <w:pPr>
-        <w:pStyle w:val="Heading2"/>
+        <w:keepNext/>
         <w:pageBreakBefore/>
-        <w:numPr>
-          <w:ilvl w:val="0"/>
-          <w:numId w:val="0"/>
-        </w:numPr>
-        <w:spacing w:before="200" w:after="120"/>
+        <w:spacing w:after="120" w:before="280"/>
       </w:pPr>
       <w:r>
         <w:rPr>
@@ -1867,6 +1936,9 @@
         <w:gridCol w:w="3213"/>
       </w:tblGrid>
       <w:tr>
+        <w:trPr>
+          <w:tblHeader w:val="true"/>
+        </w:trPr>
         <w:tc>
           <w:tcPr>
             <w:tcW w:type="dxa" w:w="2200"/>
@@ -1903,7 +1975,7 @@
         </w:tc>
         <w:tc>
           <w:tcPr>
-            <w:tcW w:type="dxa" w:w="5000"/>
+            <w:tcW w:type="dxa" w:w="5080"/>
             <w:shd w:val="clear" w:color="auto" w:fill="1F4E79"/>
           </w:tcPr>
           <w:p>
@@ -1941,6 +2013,9 @@
             <w:shd w:val="clear" w:color="auto" w:fill="FFFFFF"/>
           </w:tcPr>
           <w:p>
+            <w:pPr>
+              <w:jc w:val="right"/>
+            </w:pPr>
             <w:r/>
             <w:r>
               <w:rPr>
@@ -1952,7 +2027,7 @@
         </w:tc>
         <w:tc>
           <w:tcPr>
-            <w:tcW w:type="dxa" w:w="5000"/>
+            <w:tcW w:type="dxa" w:w="5080"/>
             <w:shd w:val="clear" w:color="auto" w:fill="FFFFFF"/>
           </w:tcPr>
           <w:p>
@@ -1988,6 +2063,9 @@
             <w:shd w:val="clear" w:color="auto" w:fill="FFFFFF"/>
           </w:tcPr>
           <w:p>
+            <w:pPr>
+              <w:jc w:val="right"/>
+            </w:pPr>
             <w:r/>
             <w:r>
               <w:rPr>
@@ -1999,7 +2077,7 @@
         </w:tc>
         <w:tc>
           <w:tcPr>
-            <w:tcW w:type="dxa" w:w="5000"/>
+            <w:tcW w:type="dxa" w:w="5080"/>
             <w:shd w:val="clear" w:color="auto" w:fill="FFFFFF"/>
           </w:tcPr>
           <w:p>
@@ -2035,6 +2113,9 @@
             <w:shd w:val="clear" w:color="auto" w:fill="FFFFFF"/>
           </w:tcPr>
           <w:p>
+            <w:pPr>
+              <w:jc w:val="right"/>
+            </w:pPr>
             <w:r/>
             <w:r>
               <w:rPr>
@@ -2046,7 +2127,7 @@
         </w:tc>
         <w:tc>
           <w:tcPr>
-            <w:tcW w:type="dxa" w:w="5000"/>
+            <w:tcW w:type="dxa" w:w="5080"/>
             <w:shd w:val="clear" w:color="auto" w:fill="FFFFFF"/>
           </w:tcPr>
           <w:p>
@@ -2082,6 +2163,9 @@
             <w:shd w:val="clear" w:color="auto" w:fill="FFFFFF"/>
           </w:tcPr>
           <w:p>
+            <w:pPr>
+              <w:jc w:val="right"/>
+            </w:pPr>
             <w:r/>
             <w:r>
               <w:rPr>
@@ -2093,7 +2177,7 @@
         </w:tc>
         <w:tc>
           <w:tcPr>
-            <w:tcW w:type="dxa" w:w="5000"/>
+            <w:tcW w:type="dxa" w:w="5080"/>
             <w:shd w:val="clear" w:color="auto" w:fill="FFFFFF"/>
           </w:tcPr>
           <w:p>
@@ -2111,6 +2195,7 @@
     <w:p>
       <w:pPr>
         <w:pStyle w:val="Heading2"/>
+        <w:keepNext/>
         <w:numPr>
           <w:ilvl w:val="0"/>
           <w:numId w:val="0"/>
@@ -2135,12 +2220,13 @@
           <w:b w:val="0"/>
           <w:sz w:val="22"/>
         </w:rPr>
-        <w:t>Category: New-to-the-world product / technology. The combination of edge-computed water scoring, a self-hosted dashboard, safe pump control and a selective robotic cleaning arm — all on a local network with no cloud dependency — is not offered by monitoring-only products or by full-drain cleaning services.</w:t>
+        <w:t>New-to-the-world product. The combination of edge-computed water scoring, a dashboard hosted on the device, safe pump control and a selective cleaning arm on one local network is not offered by monitoring products or by full-drain cleaning services. The closest alternatives cover one part of the problem.</w:t>
       </w:r>
     </w:p>
     <w:p>
       <w:pPr>
         <w:pStyle w:val="Heading1"/>
+        <w:keepNext/>
         <w:numPr>
           <w:ilvl w:val="0"/>
           <w:numId w:val="0"/>
@@ -2159,6 +2245,7 @@
     <w:p>
       <w:pPr>
         <w:pStyle w:val="Heading2"/>
+        <w:keepNext/>
         <w:numPr>
           <w:ilvl w:val="0"/>
           <w:numId w:val="0"/>
@@ -2176,62 +2263,67 @@
     </w:p>
     <w:p>
       <w:pPr>
-        <w:spacing w:after="120"/>
+        <w:spacing w:after="80"/>
+        <w:ind w:left="280"/>
       </w:pPr>
       <w:r>
         <w:rPr>
           <w:b w:val="0"/>
           <w:sz w:val="22"/>
         </w:rPr>
-        <w:t xml:space="preserve"> TankGuard Technical Specification (Document Ref: TG-SPEC-2026-001), October 2026, 7 pages.</w:t>
+        <w:t>TankGuard Technical Specification, document TG-SPEC-2026-001, October 2026, 7 pages.</w:t>
       </w:r>
     </w:p>
     <w:p>
       <w:pPr>
-        <w:spacing w:after="120"/>
+        <w:spacing w:after="80"/>
+        <w:ind w:left="280"/>
       </w:pPr>
       <w:r>
         <w:rPr>
           <w:b w:val="0"/>
           <w:sz w:val="22"/>
         </w:rPr>
-        <w:t xml:space="preserve"> Firmware for all three units, compiling for ESP8266 (M1, H1) and ESP32 (C1), plus the React dashboard served from M1 flash.</w:t>
+        <w:t>Firmware for all three units, compiling for ESP8266 (M1 and H1) and ESP32 (C1), with the React dashboard served from M1 flash.</w:t>
       </w:r>
     </w:p>
     <w:p>
       <w:pPr>
-        <w:spacing w:after="120"/>
+        <w:spacing w:after="80"/>
+        <w:ind w:left="280"/>
       </w:pPr>
       <w:r>
         <w:rPr>
           <w:b w:val="0"/>
           <w:sz w:val="22"/>
         </w:rPr>
-        <w:t xml:space="preserve"> Design record (docs/CLEANER.md): kinematics, coverage analysis and control limits, including the 2 cm wall ring the mechanism cannot reach.</w:t>
+        <w:t>Design record (docs/CLEANER.md): kinematics, coverage analysis and control limits, including the 2 cm wall ring the arm cannot reach.</w:t>
       </w:r>
     </w:p>
     <w:p>
       <w:pPr>
-        <w:spacing w:after="120"/>
+        <w:spacing w:after="80"/>
+        <w:ind w:left="280"/>
       </w:pPr>
       <w:r>
         <w:rPr>
           <w:b w:val="0"/>
           <w:sz w:val="22"/>
         </w:rPr>
-        <w:t xml:space="preserve"> Coverage planner (tools/swept_area.html) and the generated path used by the controller (firmware/c1_cleaner/path.h).</w:t>
+        <w:t>Coverage planner (tools/swept_area.html) and the generated path used by the controller (firmware/c1_cleaner/path.h).</w:t>
       </w:r>
     </w:p>
     <w:p>
       <w:pPr>
-        <w:spacing w:after="120"/>
+        <w:spacing w:after="80"/>
+        <w:ind w:left="280"/>
       </w:pPr>
       <w:r>
         <w:rPr>
           <w:b w:val="0"/>
           <w:sz w:val="22"/>
         </w:rPr>
-        <w:t xml:space="preserve"> Patentability disclosure and minimum bill of materials.</w:t>
+        <w:t>Patentability disclosure and the minimum bill of materials.</w:t>
       </w:r>
     </w:p>
     <w:sectPr>

</xml_diff>

<commit_message>
docs(office): make the grant a commercialisation request, not a parts bill
TDP 11 funds up to INR 50 lakh over 12 months for TRL 6+ projects that are ready to commercialise. The previous ask was INR 23,587, which is the prototype's parts cost and was already spent, so it read as a reimbursement request and contradicted the TRL 6 entry rule.

The request is now INR 42,33,600: two engineers, tooling, twenty pilot units, certification, a patent and twelve field installations. The prototype spend is shown as prior investment, and the milestones end at a sale rather than a demonstration.

The proposal gains a commercialisation section with the buyer, price target, market base and route to revenue. The workbook now splits every head across the three tranches, and the PI affiliation is corrected to Sree Buddha College of Engineering with Nuke Labs as the industry partner.
</commit_message>
<xml_diff>
--- a/docs/office/TankGuard_Project_Proposal.docx
+++ b/docs/office/TankGuard_Project_Proposal.docx
@@ -86,7 +86,7 @@
     </w:p>
     <w:p>
       <w:pPr>
-        <w:spacing w:after="200"/>
+        <w:spacing w:after="40"/>
         <w:jc w:val="center"/>
       </w:pPr>
       <w:r>
@@ -94,7 +94,20 @@
           <w:b w:val="0"/>
           <w:sz w:val="22"/>
         </w:rPr>
-        <w:t>Nuke Labs (industry partner)</w:t>
+        <w:t>Sree Buddha College of Engineering</w:t>
+      </w:r>
+    </w:p>
+    <w:p>
+      <w:pPr>
+        <w:spacing w:after="200"/>
+        <w:jc w:val="center"/>
+      </w:pPr>
+      <w:r>
+        <w:rPr>
+          <w:b w:val="0"/>
+          <w:sz w:val="22"/>
+        </w:rPr>
+        <w:t>Industry partner: Nuke Labs</w:t>
       </w:r>
     </w:p>
     <w:p>
@@ -303,6 +316,22 @@
           <w:sz w:val="22"/>
         </w:rPr>
         <w:t xml:space="preserve">     3.7  Category of new technology/product</w:t>
+        <w:tab/>
+        <w:t>6</w:t>
+      </w:r>
+    </w:p>
+    <w:p>
+      <w:pPr>
+        <w:tabs>
+          <w:tab w:pos="8800" w:val="right" w:leader="dot"/>
+        </w:tabs>
+        <w:spacing w:after="80"/>
+      </w:pPr>
+      <w:r>
+        <w:rPr>
+          <w:sz w:val="22"/>
+        </w:rPr>
+        <w:t xml:space="preserve">     3.8  Commercialisation plan</w:t>
         <w:tab/>
         <w:t>6</w:t>
       </w:r>
@@ -536,7 +565,7 @@
               <w:rPr>
                 <w:sz w:val="19"/>
               </w:rPr>
-              <w:t>Nuke Labs (industry partner)</w:t>
+              <w:t>Sree Buddha College of Engineering, Department of Electronics and Communication Engineering</w:t>
             </w:r>
           </w:p>
         </w:tc>
@@ -747,7 +776,19 @@
           <w:b w:val="0"/>
           <w:sz w:val="22"/>
         </w:rPr>
-        <w:t>The project delivers a working prototype of M1 and H1, the C1 cleaning arm with its planner and controller, the dashboard served by the tank unit, and field validation at TRL 6 or above with an industry partner.</w:t>
+        <w:t>The monitoring prototype is built. The M1 firmware, the dashboard and the path planner run, and INR 23,587 of parts have already been invested. The grant funds the step from that prototype to a certified product: the arm hardware, twenty pilot units, certification, a patent and twelve field installations.</w:t>
+      </w:r>
+    </w:p>
+    <w:p>
+      <w:pPr>
+        <w:spacing w:after="120"/>
+      </w:pPr>
+      <w:r>
+        <w:rPr>
+          <w:b w:val="0"/>
+          <w:sz w:val="22"/>
+        </w:rPr>
+        <w:t>The project delivers a production revision of M1 and H1, twenty pilot units of the C1 cleaning arm, twelve field installations, certification, a filed patent, and three paying pilot customers. The target is TRL 8, with the unit cost and the service model proven before the first production run.</w:t>
       </w:r>
     </w:p>
     <w:p>
@@ -797,7 +838,7 @@
           <w:b w:val="0"/>
           <w:sz w:val="22"/>
         </w:rPr>
-        <w:t>TankGuard started as a water-quality monitor. Five probes fed an edge-computed score, and the device served its own dashboard over Wi-Fi. The first build showed that an ESP8266 can carry the whole stack without a cloud service.</w:t>
+        <w:t>TankGuard started as a water-quality monitor. Five probes fed an edge-computed score, and the ESP8266 served its own dashboard over Wi-Fi, with no cloud service.</w:t>
       </w:r>
     </w:p>
     <w:p>
@@ -809,7 +850,7 @@
           <w:b w:val="0"/>
           <w:sz w:val="22"/>
         </w:rPr>
-        <w:t>Field trials exposed the real failure mode. Measurement alone does not clean a tank. The sludge layer keeps feeding turbidity and biofilm, and the household still has to drain and scrub the tank by hand. The product therefore moved from monitoring to care: a home unit that runs the pump safely, and an arm that removes the sludge without emptying the tank.</w:t>
+        <w:t>Field trials exposed the real failure mode. Measurement alone does not clean a tank: the sludge layer keeps feeding turbidity and biofilm, and the household still drains and scrubs by hand. The product moved from monitoring to care, with a home unit for the pump and an arm for the sludge.</w:t>
       </w:r>
     </w:p>
     <w:p>
@@ -852,7 +893,7 @@
           <w:b w:val="0"/>
           <w:sz w:val="22"/>
         </w:rPr>
-        <w:t>Storage tanks degrade silently. Residual chlorine disappears within 24 to 48 hours. Suspended solids settle into a sludge layer. Biofilm forms on internal surfaces, and algae grow in warm water. By the time the problem is visible, the water is already unsafe.</w:t>
+        <w:t>Storage tanks degrade silently. Residual chlorine disappears within 24 to 48 hours, suspended solids settle into a sludge layer, biofilm forms on internal surfaces, and algae grow in warm water. By the time it is visible, the water is already unsafe.</w:t>
       </w:r>
     </w:p>
     <w:p>
@@ -876,7 +917,7 @@
           <w:b w:val="0"/>
           <w:sz w:val="22"/>
         </w:rPr>
-        <w:t>The gap is largest where it matters most. Schools, hospitals and apartment buildings store large volumes, clean to a fixed calendar, and cannot tell whether the last clean helped.</w:t>
+        <w:t>The gap is largest where it matters most: schools, hospitals and apartment blocks store large volumes, clean to a fixed calendar, and cannot tell whether the last clean helped.</w:t>
       </w:r>
     </w:p>
     <w:p>
@@ -907,7 +948,7 @@
           <w:b w:val="0"/>
           <w:sz w:val="22"/>
         </w:rPr>
-        <w:t>Objective 1: measure and score water quality at the edge. Five probes (turbidity, TDS, pH, temperature, level) are digitised through an ADS1115 and fused into a weighted score (turbidity 40 percent, TDS 25, pH 25, temperature 10). Acceptance: the score repeats within 2 points across ten consecutive samples in still water.</w:t>
+        <w:t>Objective 1: measure and score water quality at the edge. Five probes (turbidity, TDS, pH, temperature, level) are digitised through an ADS1115 and fused into a weighted score (40/25/25/10). Acceptance: the score repeats within 2 points over ten consecutive samples in still water.</w:t>
       </w:r>
     </w:p>
     <w:p>
@@ -943,7 +984,7 @@
           <w:b w:val="0"/>
           <w:sz w:val="22"/>
         </w:rPr>
-        <w:t>Objective 4: prove it in the field. Twelve months to TRL 6 or above, with three installations, 90 days of continuous operation, and a published measurement of score accuracy, cleaning coverage and water saved against a full drain.</w:t>
+        <w:t>Objective 4: prove it in the field and take it to market. The monitor enters at TRL 6 and the arm at TRL 4; twelve months later the system is at TRL 8, with twenty pilot units, twelve installations, certification, a filed patent and three paying customers.</w:t>
       </w:r>
     </w:p>
     <w:p>
@@ -974,7 +1015,7 @@
           <w:b w:val="0"/>
           <w:sz w:val="22"/>
         </w:rPr>
-        <w:t>D1. M1 monitor: an ESP8266 unit on the tank lid with five calibrated probes, an edge score, and the web dashboard served from flash.</w:t>
+        <w:t>D1. M1 monitor, production revision: the ESP8266 board with five calibrated probes, an edge score, the dashboard in flash, and an enclosure that can be moulded at volume.</w:t>
       </w:r>
     </w:p>
     <w:p>
@@ -986,7 +1027,7 @@
           <w:b w:val="0"/>
           <w:sz w:val="22"/>
         </w:rPr>
-        <w:t>D2. H1 home unit: an ESP8266 with a 1.8 inch display, automatic pump control through an isolated relay and contactor, and a manual override.</w:t>
+        <w:t>D2. H1 home unit, production revision: the display board, isolated relay and contactor interface, and a manual override that passes electrical safety review.</w:t>
       </w:r>
     </w:p>
     <w:p>
@@ -998,7 +1039,7 @@
           <w:b w:val="0"/>
           <w:sz w:val="22"/>
         </w:rPr>
-        <w:t>D3. C1 cleaning arm: an ESP32 controller, a two-link arm, a ring brush head with suction, a path planner and an executor, with the coverage analysis that states its limits.</w:t>
+        <w:t>D3. C1 cleaning arm, pilot build: twenty units with the two-link arm, ring brush, suction head and the planner-generated path, at a confirmed unit cost.</w:t>
       </w:r>
     </w:p>
     <w:p>
@@ -1010,7 +1051,7 @@
           <w:b w:val="0"/>
           <w:sz w:val="22"/>
         </w:rPr>
-        <w:t>D4. Field evidence: three installations, 90 days of data, and a TRL 6 evidence pack covering score accuracy and cleaning coverage.</w:t>
+        <w:t>D4. Commercial pack: twelve installations, certification and patent filed, three paying pilot customers, a channel agreement, and the TRL 8 evidence set.</w:t>
       </w:r>
     </w:p>
     <w:p>
@@ -1042,7 +1083,7 @@
           <w:b w:val="0"/>
           <w:sz w:val="22"/>
         </w:rPr>
-        <w:t>Twelve months from T0, with a demonstration at every gate.</w:t>
+        <w:t>Twelve months from T0, with a deliverable at every gate.</w:t>
       </w:r>
     </w:p>
     <w:tbl>
@@ -1158,7 +1199,7 @@
               <w:rPr>
                 <w:sz w:val="19"/>
               </w:rPr>
-              <w:t>Requirements and monitor prototype</w:t>
+              <w:t>Design freeze and tooling</w:t>
             </w:r>
           </w:p>
         </w:tc>
@@ -1173,7 +1214,7 @@
               <w:rPr>
                 <w:sz w:val="19"/>
               </w:rPr>
-              <w:t>T0 + 2 months</w:t>
+              <w:t>T0 + 3 months</w:t>
             </w:r>
           </w:p>
         </w:tc>
@@ -1188,7 +1229,7 @@
               <w:rPr>
                 <w:sz w:val="19"/>
               </w:rPr>
-              <w:t>M1 assembled and calibrated. Score validated against reference instruments. Dashboard served from flash.</w:t>
+              <w:t>Arm and enclosure frozen. Moulds ordered. Five pilot sets assembled. Certification scope agreed with the test laboratory.</w:t>
             </w:r>
           </w:p>
         </w:tc>
@@ -1220,7 +1261,7 @@
               <w:rPr>
                 <w:sz w:val="19"/>
               </w:rPr>
-              <w:t>Home unit and dashboard</w:t>
+              <w:t>Pilot build and lab qualification</w:t>
             </w:r>
           </w:p>
         </w:tc>
@@ -1235,7 +1276,7 @@
               <w:rPr>
                 <w:sz w:val="19"/>
               </w:rPr>
-              <w:t>T0 + 4 months</w:t>
+              <w:t>T0 + 6 months</w:t>
             </w:r>
           </w:p>
         </w:tc>
@@ -1250,7 +1291,7 @@
               <w:rPr>
                 <w:sz w:val="19"/>
               </w:rPr>
-              <w:t>H1 installed with pump control. Dashboard, session log and device table complete.</w:t>
+              <w:t>Twenty pilot sets built and calibrated against reference instruments. IP68 and EMC pre-compliance passed. Unit cost confirmed at INR 15,600 or below.</w:t>
             </w:r>
           </w:p>
         </w:tc>
@@ -1282,7 +1323,7 @@
               <w:rPr>
                 <w:sz w:val="19"/>
               </w:rPr>
-              <w:t>Cleaning arm</w:t>
+              <w:t>Field deployment</w:t>
             </w:r>
           </w:p>
         </w:tc>
@@ -1297,7 +1338,7 @@
               <w:rPr>
                 <w:sz w:val="19"/>
               </w:rPr>
-              <w:t>T0 + 8 months</w:t>
+              <w:t>T0 + 9 months</w:t>
             </w:r>
           </w:p>
         </w:tc>
@@ -1312,7 +1353,7 @@
               <w:rPr>
                 <w:sz w:val="19"/>
               </w:rPr>
-              <w:t>C1 built. Three-ring cycle executed. Coverage and repeatability measured.</w:t>
+              <w:t>Twelve installations in three cities with sixty days of continuous operation. Installation manual and service workflow complete.</w:t>
             </w:r>
           </w:p>
         </w:tc>
@@ -1344,7 +1385,7 @@
               <w:rPr>
                 <w:sz w:val="19"/>
               </w:rPr>
-              <w:t>Field validation</w:t>
+              <w:t>Commercial readiness</w:t>
             </w:r>
           </w:p>
         </w:tc>
@@ -1374,7 +1415,7 @@
               <w:rPr>
                 <w:sz w:val="19"/>
               </w:rPr>
-              <w:t>Three installations, 90 days of data, TRL 6 evidence pack.</w:t>
+              <w:t>Certification filed, patent filed, three paying pilot customers, channel agreement signed, TRL 8 evidence pack.</w:t>
             </w:r>
           </w:p>
         </w:tc>
@@ -1480,7 +1521,7 @@
               <w:rPr>
                 <w:sz w:val="19"/>
               </w:rPr>
-              <w:t>0</w:t>
+              <w:t>12,00,000</w:t>
             </w:r>
           </w:p>
         </w:tc>
@@ -1515,7 +1556,7 @@
               <w:rPr>
                 <w:sz w:val="19"/>
               </w:rPr>
-              <w:t>15,600</w:t>
+              <w:t>6,00,000</w:t>
             </w:r>
           </w:p>
         </w:tc>
@@ -1550,7 +1591,7 @@
               <w:rPr>
                 <w:sz w:val="19"/>
               </w:rPr>
-              <w:t>0</w:t>
+              <w:t>3,60,000</w:t>
             </w:r>
           </w:p>
         </w:tc>
@@ -1585,7 +1626,7 @@
               <w:rPr>
                 <w:sz w:val="19"/>
               </w:rPr>
-              <w:t>0</w:t>
+              <w:t>2,00,000</w:t>
             </w:r>
           </w:p>
         </w:tc>
@@ -1620,7 +1661,7 @@
               <w:rPr>
                 <w:sz w:val="19"/>
               </w:rPr>
-              <w:t>0</w:t>
+              <w:t>4,40,000</w:t>
             </w:r>
           </w:p>
         </w:tc>
@@ -1655,7 +1696,7 @@
               <w:rPr>
                 <w:sz w:val="19"/>
               </w:rPr>
-              <w:t>780</w:t>
+              <w:t>1,40,000</w:t>
             </w:r>
           </w:p>
         </w:tc>
@@ -1690,7 +1731,7 @@
               <w:rPr>
                 <w:sz w:val="19"/>
               </w:rPr>
-              <w:t>16,380</w:t>
+              <w:t>29,40,000</w:t>
             </w:r>
           </w:p>
         </w:tc>
@@ -1725,7 +1766,7 @@
               <w:rPr>
                 <w:sz w:val="19"/>
               </w:rPr>
-              <w:t>3,276</w:t>
+              <w:t>5,88,000</w:t>
             </w:r>
           </w:p>
         </w:tc>
@@ -1760,7 +1801,7 @@
               <w:rPr>
                 <w:sz w:val="19"/>
               </w:rPr>
-              <w:t>3,931</w:t>
+              <w:t>7,05,600</w:t>
             </w:r>
           </w:p>
         </w:tc>
@@ -1795,7 +1836,7 @@
               <w:rPr>
                 <w:sz w:val="19"/>
               </w:rPr>
-              <w:t>23,587</w:t>
+              <w:t>42,33,600</w:t>
             </w:r>
           </w:p>
         </w:tc>
@@ -1865,7 +1906,7 @@
               <w:rPr>
                 <w:sz w:val="19"/>
               </w:rPr>
-              <w:t>23,587</w:t>
+              <w:t>42,33,600</w:t>
             </w:r>
           </w:p>
         </w:tc>
@@ -1881,7 +1922,7 @@
           <w:b w:val="0"/>
           <w:sz w:val="20"/>
         </w:rPr>
-        <w:t>Equipment split, indicative: M1 monitor INR 6,500; H1 home unit INR 1,800; C1 cleaning arm INR 7,300. The C1 figure covers two 12 V planetary gearmotors, an ESP32, two H-bridges, a submersible pump, the brush head and the enclosure.</w:t>
+        <w:t>Manpower covers two full-time engineers for twelve months, one mechanical and one firmware, at INR 50,000 per month each. Equipment covers enclosure tooling (INR 4.0 lakh) and a tank test rig with reference instruments (INR 2.0 lakh). Consumables cover twenty pilot sets at INR 15,600 each, plus PCB fabrication and spares.</w:t>
       </w:r>
     </w:p>
     <w:p>
@@ -1893,7 +1934,7 @@
           <w:b w:val="0"/>
           <w:sz w:val="20"/>
         </w:rPr>
-        <w:t>Contingency is capped at 5 percent of project value, overhead at 20 percent of the sub total, and the faculty fee at 20 percent of the total.</w:t>
+        <w:t>Miscellaneous covers certification (INR 2.0 lakh), patent drafting and filing (INR 1.4 lakh), and market work with channel partners (INR 1.0 lakh). Contingency is capped at 5 percent of direct cost, overhead at 20 percent of the sub total, and the faculty fee at 20 percent of the total.</w:t>
       </w:r>
     </w:p>
     <w:p>
@@ -1905,7 +1946,7 @@
           <w:b w:val="0"/>
           <w:sz w:val="20"/>
         </w:rPr>
-        <w:t>Manpower, consumables, travel and miscellaneous heads will be agreed at the grant kickoff. Equipment figures are vendor quotes pending confirmation.</w:t>
+        <w:t>Prototype parts to date total INR 23,587 and have already been invested by the team. They are not part of this request. The request funds the product, not the prototype.</w:t>
       </w:r>
     </w:p>
     <w:p>
@@ -2021,7 +2062,7 @@
               <w:rPr>
                 <w:sz w:val="19"/>
               </w:rPr>
-              <w:t>8,235</w:t>
+              <w:t>15,33,168</w:t>
             </w:r>
           </w:p>
         </w:tc>
@@ -2036,7 +2077,7 @@
               <w:rPr>
                 <w:sz w:val="19"/>
               </w:rPr>
-              <w:t>M1 monitor build and dashboard</w:t>
+              <w:t>Design freeze, tooling and the first pilot sets</w:t>
             </w:r>
           </w:p>
         </w:tc>
@@ -2071,7 +2112,7 @@
               <w:rPr>
                 <w:sz w:val="19"/>
               </w:rPr>
-              <w:t>9,415</w:t>
+              <w:t>16,84,368</w:t>
             </w:r>
           </w:p>
         </w:tc>
@@ -2086,7 +2127,7 @@
               <w:rPr>
                 <w:sz w:val="19"/>
               </w:rPr>
-              <w:t>H1 home unit and C1 cleaning arm</w:t>
+              <w:t>Pilot build, certification testing and field deployment</w:t>
             </w:r>
           </w:p>
         </w:tc>
@@ -2121,7 +2162,7 @@
               <w:rPr>
                 <w:sz w:val="19"/>
               </w:rPr>
-              <w:t>5,937</w:t>
+              <w:t>10,16,064</w:t>
             </w:r>
           </w:p>
         </w:tc>
@@ -2136,7 +2177,7 @@
               <w:rPr>
                 <w:sz w:val="19"/>
               </w:rPr>
-              <w:t>Field validation and evidence pack</w:t>
+              <w:t>Validation close-out, IP filing and commercial launch</w:t>
             </w:r>
           </w:p>
         </w:tc>
@@ -2171,7 +2212,7 @@
               <w:rPr>
                 <w:sz w:val="19"/>
               </w:rPr>
-              <w:t>23,587</w:t>
+              <w:t>42,33,600</w:t>
             </w:r>
           </w:p>
         </w:tc>
@@ -2225,6 +2266,85 @@
     </w:p>
     <w:p>
       <w:pPr>
+        <w:pStyle w:val="Heading2"/>
+        <w:keepNext/>
+        <w:numPr>
+          <w:ilvl w:val="0"/>
+          <w:numId w:val="0"/>
+        </w:numPr>
+        <w:spacing w:before="200" w:after="120"/>
+      </w:pPr>
+      <w:r>
+        <w:rPr>
+          <w:b/>
+          <w:color w:val="2E74B5"/>
+          <w:sz w:val="25"/>
+        </w:rPr>
+        <w:t>3.8  Commercialisation plan</w:t>
+      </w:r>
+    </w:p>
+    <w:p>
+      <w:pPr>
+        <w:spacing w:after="120"/>
+      </w:pPr>
+      <w:r>
+        <w:rPr>
+          <w:b w:val="0"/>
+          <w:sz w:val="22"/>
+        </w:rPr>
+        <w:t>The buyer is the contractor or facility manager who already pays for cleaning. A household buys a clean, not a device, so the arm is sold to the contractor who visits the tank, and the monitor is sold to the institution that wants a reading between cleans.</w:t>
+      </w:r>
+    </w:p>
+    <w:p>
+      <w:pPr>
+        <w:spacing w:after="120"/>
+      </w:pPr>
+      <w:r>
+        <w:rPr>
+          <w:b w:val="0"/>
+          <w:sz w:val="22"/>
+        </w:rPr>
+        <w:t>Price targets: INR 39,999 for the complete system (M1, H1 and C1) against INR 15,600 of parts, a gross margin near 61 percent. The monitor and home unit alone sell at INR 16,999 for sites that do not need the arm.</w:t>
+      </w:r>
+    </w:p>
+    <w:p>
+      <w:pPr>
+        <w:spacing w:after="120"/>
+      </w:pPr>
+      <w:r>
+        <w:rPr>
+          <w:b w:val="0"/>
+          <w:sz w:val="22"/>
+        </w:rPr>
+        <w:t>Market base: 79 million urban households in the 2011 Census, of which about 60 percent are assumed to store water in a tank (47 million), plus 1.5 million schools and 70,000 hospitals. A tank clean sells for INR 1,500 to 4,000 in urban India, once or twice a year.</w:t>
+      </w:r>
+    </w:p>
+    <w:p>
+      <w:pPr>
+        <w:spacing w:after="120"/>
+      </w:pPr>
+      <w:r>
+        <w:rPr>
+          <w:b w:val="0"/>
+          <w:sz w:val="22"/>
+        </w:rPr>
+        <w:t>Route to revenue: three paying pilot sites in the grant year, converted to reference accounts; two channel partners in the following year, one in cleaning services and one in plumbing distribution; a target of 250 units in the first full year of sale.</w:t>
+      </w:r>
+    </w:p>
+    <w:p>
+      <w:pPr>
+        <w:spacing w:after="120"/>
+      </w:pPr>
+      <w:r>
+        <w:rPr>
+          <w:b w:val="0"/>
+          <w:sz w:val="22"/>
+        </w:rPr>
+        <w:t>The grant pays for the tooling, certification and pilot units that a first customer will not fund. Nuke Labs carries the channel, the service network and the field access.</w:t>
+      </w:r>
+    </w:p>
+    <w:p>
+      <w:pPr>
         <w:pStyle w:val="Heading1"/>
         <w:keepNext/>
         <w:numPr>
@@ -2324,6 +2444,19 @@
           <w:sz w:val="22"/>
         </w:rPr>
         <w:t>Patentability disclosure and the minimum bill of materials.</w:t>
+      </w:r>
+    </w:p>
+    <w:p>
+      <w:pPr>
+        <w:spacing w:after="80"/>
+        <w:ind w:left="280"/>
+      </w:pPr>
+      <w:r>
+        <w:rPr>
+          <w:b w:val="0"/>
+          <w:sz w:val="22"/>
+        </w:rPr>
+        <w:t>Prototype spend to date: INR 23,587 in parts, with the monitor running at TRL 6.</w:t>
       </w:r>
     </w:p>
     <w:sectPr>

</xml_diff>

<commit_message>
docs(office): cap the faculty fee at 3 lakh and move the balance into R&D
The faculty fee was 7.06 lakh at the 20 percent cap. It is now 3.00 lakh, and the released amount buys equipment and consumables: reference instruments for the R&D bench (2.4 lakh) and five more pilot sets (0.8 lakh).

Because contingency and overhead are percentages, redirecting the fee also moves those two heads. The grand total falls by 2,400 to 42,31,200, and the tranches are recomputed so every head still sums across the three phases.
</commit_message>
<xml_diff>
--- a/docs/office/TankGuard_Project_Proposal.docx
+++ b/docs/office/TankGuard_Project_Proposal.docx
@@ -776,7 +776,7 @@
           <w:b w:val="0"/>
           <w:sz w:val="22"/>
         </w:rPr>
-        <w:t>The monitoring prototype is built. The M1 firmware, the dashboard and the path planner run, and INR 23,587 of parts have already been invested. The grant funds the step from that prototype to a certified product: the arm hardware, twenty pilot units, certification, a patent and twelve field installations.</w:t>
+        <w:t>The monitoring prototype is built. The M1 firmware, the dashboard and the path planner run, and INR 23,587 of parts have already been invested. The grant funds the step from that prototype to a certified product: the arm hardware, twenty-five pilot units, certification, a patent and twelve field installations.</w:t>
       </w:r>
     </w:p>
     <w:p>
@@ -788,7 +788,7 @@
           <w:b w:val="0"/>
           <w:sz w:val="22"/>
         </w:rPr>
-        <w:t>The project delivers a production revision of M1 and H1, twenty pilot units of the C1 cleaning arm, twelve field installations, certification, a filed patent, and three paying pilot customers. The target is TRL 8, with the unit cost and the service model proven before the first production run.</w:t>
+        <w:t>The project delivers a production revision of M1 and H1, twenty-five pilot units of the C1 cleaning arm, twelve field installations, certification, a filed patent, and three paying pilot customers. The target is TRL 8, with the unit cost and the service model proven before the first production run.</w:t>
       </w:r>
     </w:p>
     <w:p>
@@ -984,7 +984,7 @@
           <w:b w:val="0"/>
           <w:sz w:val="22"/>
         </w:rPr>
-        <w:t>Objective 4: prove it in the field and take it to market. The monitor enters at TRL 6 and the arm at TRL 4; twelve months later the system is at TRL 8, with twenty pilot units, twelve installations, certification, a filed patent and three paying customers.</w:t>
+        <w:t>Objective 4: prove it in the field and take it to market. The monitor enters at TRL 6 and the arm at TRL 4; twelve months later the system is at TRL 8, with twenty-five pilot units, twelve installations, certification, a filed patent and three paying customers.</w:t>
       </w:r>
     </w:p>
     <w:p>
@@ -1039,7 +1039,7 @@
           <w:b w:val="0"/>
           <w:sz w:val="22"/>
         </w:rPr>
-        <w:t>D3. C1 cleaning arm, pilot build: twenty units with the two-link arm, ring brush, suction head and the planner-generated path, at a confirmed unit cost.</w:t>
+        <w:t>D3. C1 cleaning arm, pilot build: twenty-five units with the two-link arm, ring brush, suction head and the planner-generated path, at a confirmed unit cost.</w:t>
       </w:r>
     </w:p>
     <w:p>
@@ -1291,7 +1291,7 @@
               <w:rPr>
                 <w:sz w:val="19"/>
               </w:rPr>
-              <w:t>Twenty pilot sets built and calibrated against reference instruments. IP68 and EMC pre-compliance passed. Unit cost confirmed at INR 15,600 or below.</w:t>
+              <w:t>Twenty-five pilot sets built and calibrated against reference instruments. IP68 and EMC pre-compliance passed. Unit cost confirmed at INR 15,600 or below.</w:t>
             </w:r>
           </w:p>
         </w:tc>
@@ -1556,7 +1556,7 @@
               <w:rPr>
                 <w:sz w:val="19"/>
               </w:rPr>
-              <w:t>6,00,000</w:t>
+              <w:t>8,40,000</w:t>
             </w:r>
           </w:p>
         </w:tc>
@@ -1591,7 +1591,7 @@
               <w:rPr>
                 <w:sz w:val="19"/>
               </w:rPr>
-              <w:t>3,60,000</w:t>
+              <w:t>4,40,000</w:t>
             </w:r>
           </w:p>
         </w:tc>
@@ -1696,7 +1696,7 @@
               <w:rPr>
                 <w:sz w:val="19"/>
               </w:rPr>
-              <w:t>1,40,000</w:t>
+              <w:t>1,56,000</w:t>
             </w:r>
           </w:p>
         </w:tc>
@@ -1731,7 +1731,7 @@
               <w:rPr>
                 <w:sz w:val="19"/>
               </w:rPr>
-              <w:t>29,40,000</w:t>
+              <w:t>32,76,000</w:t>
             </w:r>
           </w:p>
         </w:tc>
@@ -1766,7 +1766,7 @@
               <w:rPr>
                 <w:sz w:val="19"/>
               </w:rPr>
-              <w:t>5,88,000</w:t>
+              <w:t>6,55,200</w:t>
             </w:r>
           </w:p>
         </w:tc>
@@ -1801,7 +1801,7 @@
               <w:rPr>
                 <w:sz w:val="19"/>
               </w:rPr>
-              <w:t>7,05,600</w:t>
+              <w:t>3,00,000</w:t>
             </w:r>
           </w:p>
         </w:tc>
@@ -1836,7 +1836,7 @@
               <w:rPr>
                 <w:sz w:val="19"/>
               </w:rPr>
-              <w:t>42,33,600</w:t>
+              <w:t>42,31,200</w:t>
             </w:r>
           </w:p>
         </w:tc>
@@ -1906,7 +1906,7 @@
               <w:rPr>
                 <w:sz w:val="19"/>
               </w:rPr>
-              <w:t>42,33,600</w:t>
+              <w:t>42,31,200</w:t>
             </w:r>
           </w:p>
         </w:tc>
@@ -1922,7 +1922,7 @@
           <w:b w:val="0"/>
           <w:sz w:val="20"/>
         </w:rPr>
-        <w:t>Manpower covers two full-time engineers for twelve months, one mechanical and one firmware, at INR 50,000 per month each. Equipment covers enclosure tooling (INR 4.0 lakh) and a tank test rig with reference instruments (INR 2.0 lakh). Consumables cover twenty pilot sets at INR 15,600 each, plus PCB fabrication and spares.</w:t>
+        <w:t>Manpower covers two full-time engineers for twelve months, one mechanical and one firmware, at INR 50,000 per month each. Equipment covers enclosure tooling (INR 4.0 lakh), a tank test rig (INR 2.0 lakh) and reference instruments for the R&amp;D bench (INR 2.4 lakh). Consumables cover twenty-five pilot sets at INR 15,600 each, plus PCB fabrication and spares.</w:t>
       </w:r>
     </w:p>
     <w:p>
@@ -1934,7 +1934,7 @@
           <w:b w:val="0"/>
           <w:sz w:val="20"/>
         </w:rPr>
-        <w:t>Miscellaneous covers certification (INR 2.0 lakh), patent drafting and filing (INR 1.4 lakh), and market work with channel partners (INR 1.0 lakh). Contingency is capped at 5 percent of direct cost, overhead at 20 percent of the sub total, and the faculty fee at 20 percent of the total.</w:t>
+        <w:t>Miscellaneous covers certification (INR 2.0 lakh), patent drafting and filing (INR 1.4 lakh), and market work with channel partners (INR 1.0 lakh). Contingency is capped at 5 percent of direct cost and overhead at 20 percent of the sub total. The faculty fee is set at INR 3.0 lakh, below the 20 percent cap, and the difference is carried in equipment and consumables for R&amp;D.</w:t>
       </w:r>
     </w:p>
     <w:p>
@@ -2062,7 +2062,7 @@
               <w:rPr>
                 <w:sz w:val="19"/>
               </w:rPr>
-              <w:t>15,33,168</w:t>
+              <w:t>15,69,160</w:t>
             </w:r>
           </w:p>
         </w:tc>
@@ -2112,7 +2112,7 @@
               <w:rPr>
                 <w:sz w:val="19"/>
               </w:rPr>
-              <w:t>16,84,368</w:t>
+              <w:t>16,39,560</w:t>
             </w:r>
           </w:p>
         </w:tc>
@@ -2162,7 +2162,7 @@
               <w:rPr>
                 <w:sz w:val="19"/>
               </w:rPr>
-              <w:t>10,16,064</w:t>
+              <w:t>10,22,480</w:t>
             </w:r>
           </w:p>
         </w:tc>
@@ -2212,7 +2212,7 @@
               <w:rPr>
                 <w:sz w:val="19"/>
               </w:rPr>
-              <w:t>42,33,600</w:t>
+              <w:t>42,31,200</w:t>
             </w:r>
           </w:p>
         </w:tc>

</xml_diff>

<commit_message>
docs(office): name Nuke Labs as the employer of the project engineers
The manpower head pays two engineers at Nuke Labs, so the college pay scale does not apply. The budget note now says so. No party-by-party allocation is shown, and the table is back to the two columns the template prescribes.
</commit_message>
<xml_diff>
--- a/docs/office/TankGuard_Project_Proposal.docx
+++ b/docs/office/TankGuard_Project_Proposal.docx
@@ -1922,7 +1922,7 @@
           <w:b w:val="0"/>
           <w:sz w:val="20"/>
         </w:rPr>
-        <w:t>Manpower covers two full-time engineers for twelve months, one mechanical and one firmware, at INR 50,000 per month each. Equipment covers enclosure tooling (INR 4.0 lakh), a tank test rig (INR 2.0 lakh) and reference instruments for the R&amp;D bench (INR 2.4 lakh). Consumables cover twenty-five pilot sets at INR 15,600 each, plus PCB fabrication and spares.</w:t>
+        <w:t>Manpower covers two full-time engineers at Nuke Labs for twelve months, one mechanical and one firmware, at INR 50,000 per month each. Equipment covers enclosure tooling (INR 4.0 lakh), a tank test rig (INR 2.0 lakh) and reference instruments for validation (INR 2.4 lakh). Consumables cover twenty-five pilot sets at INR 15,600 each, plus PCB fabrication and spares.</w:t>
       </w:r>
     </w:p>
     <w:p>
@@ -1934,7 +1934,7 @@
           <w:b w:val="0"/>
           <w:sz w:val="20"/>
         </w:rPr>
-        <w:t>Miscellaneous covers certification (INR 2.0 lakh), patent drafting and filing (INR 1.4 lakh), and market work with channel partners (INR 1.0 lakh). Contingency is capped at 5 percent of direct cost and overhead at 20 percent of the sub total. The faculty fee is set at INR 3.0 lakh, below the 20 percent cap, and the difference is carried in equipment and consumables for R&amp;D.</w:t>
+        <w:t>Miscellaneous covers certification (INR 2.0 lakh), patent drafting and filing (INR 1.4 lakh), and market work with channel partners (INR 1.0 lakh). Travel covers the field installations and review meetings (INR 2.0 lakh). Contingency is 5 percent of direct cost and overhead 20 percent of the sub total; the faculty fee is INR 3.0 lakh, below the 20 percent cap.</w:t>
       </w:r>
     </w:p>
     <w:p>
@@ -1946,7 +1946,7 @@
           <w:b w:val="0"/>
           <w:sz w:val="20"/>
         </w:rPr>
-        <w:t>Prototype parts to date total INR 23,587 and have already been invested by the team. They are not part of this request. The request funds the product, not the prototype.</w:t>
+        <w:t>Prototype parts to date total INR 23,587, already invested and not part of this request.</w:t>
       </w:r>
     </w:p>
     <w:p>

</xml_diff>

<commit_message>
docs(office): add the institute logos, set the Water Management theme, and make costs GST-inclusive
The cover now carries the TIH and IIT Bombay marks with the foundation's contact strip, composed into one band and placed in the first-page footer so Word renders it reliably.

The theme field reads Water Management. The history section is now a 185-word review of five prior studies: tank monitoring on ESP32 and ESP8266, and the Gazebo-only cleaning robot. The objectives open with an 81-word statement of the gap against that work.

Every cost line is now labelled inclusive of GST, in the proposal, the deck and the workbook.
</commit_message>
<xml_diff>
--- a/docs/office/TankGuard_Project_Proposal.docx
+++ b/docs/office/TankGuard_Project_Proposal.docx
@@ -120,7 +120,7 @@
           <w:b w:val="0"/>
           <w:sz w:val="21"/>
         </w:rPr>
-        <w:t>Theme: TIH IoT Technology Development Program 2026</w:t>
+        <w:t>Theme: Water Management</w:t>
       </w:r>
     </w:p>
     <w:p>
@@ -661,7 +661,7 @@
               <w:rPr>
                 <w:sz w:val="19"/>
               </w:rPr>
-              <w:t>TIH IoT Technology Development Program 2026</w:t>
+              <w:t>Water Management</w:t>
             </w:r>
           </w:p>
         </w:tc>
@@ -838,7 +838,7 @@
           <w:b w:val="0"/>
           <w:sz w:val="22"/>
         </w:rPr>
-        <w:t>TankGuard started as a water-quality monitor. Five probes fed an edge-computed score, and the ESP8266 served its own dashboard over Wi-Fi, with no cloud service.</w:t>
+        <w:t>Household and building tank monitoring is well covered. Singh et al. (2021) monitored level and pH in a building tank over 2.4 GHz radio with a cloud dashboard. Rayni et al. (2023) added turbidity and TDS on an ESP32 and displayed them in Blynk. Irawan et al. (2024) reported a household unit with pH, TDS, turbidity and temperature, and Nugraha (2026) added a 16-bit ADS1115 front end with rule-based classification. Each ends at the reading: the owner is told the water is bad and must arrange the clean.</w:t>
       </w:r>
     </w:p>
     <w:p>
@@ -850,7 +850,7 @@
           <w:b w:val="0"/>
           <w:sz w:val="22"/>
         </w:rPr>
-        <w:t>Field trials exposed the real failure mode. Measurement alone does not clean a tank: the sludge layer keeps feeding turbidity and biofilm, and the household still drains and scrubs by hand. The product moved from monitoring to care, with a home unit for the pump and an arm for the sludge.</w:t>
+        <w:t>Cleaning has been studied separately. Megalingam et al. (2022) simulated a robot that cleans tank floors and walls in Gazebo under ROS, and wall-climbing cleaners are sold for large tanks. Neither is a selective floor cleaner that leaves the stored water in place, and neither reports how much of the floor it covered.</w:t>
       </w:r>
     </w:p>
     <w:p>
@@ -862,7 +862,7 @@
           <w:b w:val="0"/>
           <w:sz w:val="22"/>
         </w:rPr>
-        <w:t>The current design keeps the five probes, the score weights and the local-only architecture. It replaces the abandoned drain-and-flush mechanism with the cleaning arm described here.</w:t>
+        <w:t>TankGuard began as a monitor in that first group. Field trials showed the gap: a reading does not remove the sludge that keeps producing it. The design moved to a planned arm that cleans the floor without a drain, driven by the same score.</w:t>
       </w:r>
     </w:p>
     <w:p>
@@ -948,6 +948,18 @@
           <w:b w:val="0"/>
           <w:sz w:val="22"/>
         </w:rPr>
+        <w:t>Previous work either measures the water or cleans the tank. Monitoring systems (Singh 2021; Rayni 2023; Irawan 2024) stop at the reading and leave the clean to the owner. Cleaning robots (Megalingam 2022) are simulated or built for large walls, and none reports floor coverage or keeps the stored water. TankGuard closes the loop: one local score decides when to clean, a planned arm cleans 90 percent of the floor without draining, and the same score reports whether the clean worked.</w:t>
+      </w:r>
+    </w:p>
+    <w:p>
+      <w:pPr>
+        <w:spacing w:after="120"/>
+      </w:pPr>
+      <w:r>
+        <w:rPr>
+          <w:b w:val="0"/>
+          <w:sz w:val="22"/>
+        </w:rPr>
         <w:t>Objective 1: measure and score water quality at the edge. Five probes (turbidity, TDS, pH, temperature, level) are digitised through an ADS1115 and fused into a weighted score (40/25/25/10). Acceptance: the score repeats within 2 points over ten consecutive samples in still water.</w:t>
       </w:r>
     </w:p>
@@ -1058,7 +1070,6 @@
       <w:pPr>
         <w:pStyle w:val="Heading2"/>
         <w:keepNext/>
-        <w:pageBreakBefore/>
         <w:numPr>
           <w:ilvl w:val="0"/>
           <w:numId w:val="0"/>
@@ -1486,7 +1497,7 @@
                 <w:color w:val="FFFFFF"/>
                 <w:sz w:val="19"/>
               </w:rPr>
-              <w:t>Amount (INR)</w:t>
+              <w:t>Amount (INR, incl. GST)</w:t>
             </w:r>
           </w:p>
         </w:tc>
@@ -1538,7 +1549,7 @@
               <w:rPr>
                 <w:sz w:val="19"/>
               </w:rPr>
-              <w:t>Equipment (exclusive of GST)</w:t>
+              <w:t>Equipment</w:t>
             </w:r>
           </w:p>
         </w:tc>
@@ -1853,7 +1864,7 @@
               <w:rPr>
                 <w:sz w:val="19"/>
               </w:rPr>
-              <w:t>GST (18%)</w:t>
+              <w:t>GST (18%, included)</w:t>
             </w:r>
           </w:p>
         </w:tc>
@@ -1888,7 +1899,7 @@
               <w:rPr>
                 <w:sz w:val="19"/>
               </w:rPr>
-              <w:t>Grand total</w:t>
+              <w:t>Grand total (inclusive of GST)</w:t>
             </w:r>
           </w:p>
         </w:tc>
@@ -1922,7 +1933,7 @@
           <w:b w:val="0"/>
           <w:sz w:val="20"/>
         </w:rPr>
-        <w:t>Manpower covers two full-time engineers at Nuke Labs for twelve months, one mechanical and one firmware, at INR 50,000 per month each. Equipment covers enclosure tooling (INR 4.0 lakh), a tank test rig (INR 2.0 lakh) and reference instruments for validation (INR 2.4 lakh). Consumables cover twenty-five pilot sets at INR 15,600 each, plus PCB fabrication and spares.</w:t>
+        <w:t>All figures are inclusive of GST at 18 percent. Manpower covers two full-time engineers at Nuke Labs for twelve months, one mechanical and one firmware, at INR 50,000 per month each. Equipment covers enclosure tooling (INR 4.0 lakh), a tank test rig (INR 2.0 lakh) and reference instruments for validation (INR 2.4 lakh). Consumables cover twenty-five pilot sets at INR 15,600 each, plus PCB fabrication and spares.</w:t>
       </w:r>
     </w:p>
     <w:p>
@@ -1999,7 +2010,7 @@
         </w:tc>
         <w:tc>
           <w:tcPr>
-            <w:tcW w:type="dxa" w:w="1800"/>
+            <w:tcW w:type="dxa" w:w="2200"/>
             <w:shd w:val="clear" w:color="auto" w:fill="1F4E79"/>
           </w:tcPr>
           <w:p>
@@ -2010,13 +2021,13 @@
                 <w:color w:val="FFFFFF"/>
                 <w:sz w:val="19"/>
               </w:rPr>
-              <w:t>Amount (INR)</w:t>
+              <w:t>Amount (INR, incl. GST)</w:t>
             </w:r>
           </w:p>
         </w:tc>
         <w:tc>
           <w:tcPr>
-            <w:tcW w:type="dxa" w:w="5080"/>
+            <w:tcW w:type="dxa" w:w="4680"/>
             <w:shd w:val="clear" w:color="auto" w:fill="1F4E79"/>
           </w:tcPr>
           <w:p>
@@ -2050,7 +2061,7 @@
         </w:tc>
         <w:tc>
           <w:tcPr>
-            <w:tcW w:type="dxa" w:w="1800"/>
+            <w:tcW w:type="dxa" w:w="2200"/>
             <w:shd w:val="clear" w:color="auto" w:fill="FFFFFF"/>
           </w:tcPr>
           <w:p>
@@ -2068,7 +2079,7 @@
         </w:tc>
         <w:tc>
           <w:tcPr>
-            <w:tcW w:type="dxa" w:w="5080"/>
+            <w:tcW w:type="dxa" w:w="4680"/>
             <w:shd w:val="clear" w:color="auto" w:fill="FFFFFF"/>
           </w:tcPr>
           <w:p>
@@ -2100,7 +2111,7 @@
         </w:tc>
         <w:tc>
           <w:tcPr>
-            <w:tcW w:type="dxa" w:w="1800"/>
+            <w:tcW w:type="dxa" w:w="2200"/>
             <w:shd w:val="clear" w:color="auto" w:fill="FFFFFF"/>
           </w:tcPr>
           <w:p>
@@ -2118,7 +2129,7 @@
         </w:tc>
         <w:tc>
           <w:tcPr>
-            <w:tcW w:type="dxa" w:w="5080"/>
+            <w:tcW w:type="dxa" w:w="4680"/>
             <w:shd w:val="clear" w:color="auto" w:fill="FFFFFF"/>
           </w:tcPr>
           <w:p>
@@ -2150,7 +2161,7 @@
         </w:tc>
         <w:tc>
           <w:tcPr>
-            <w:tcW w:type="dxa" w:w="1800"/>
+            <w:tcW w:type="dxa" w:w="2200"/>
             <w:shd w:val="clear" w:color="auto" w:fill="FFFFFF"/>
           </w:tcPr>
           <w:p>
@@ -2168,7 +2179,7 @@
         </w:tc>
         <w:tc>
           <w:tcPr>
-            <w:tcW w:type="dxa" w:w="5080"/>
+            <w:tcW w:type="dxa" w:w="4680"/>
             <w:shd w:val="clear" w:color="auto" w:fill="FFFFFF"/>
           </w:tcPr>
           <w:p>
@@ -2200,7 +2211,7 @@
         </w:tc>
         <w:tc>
           <w:tcPr>
-            <w:tcW w:type="dxa" w:w="1800"/>
+            <w:tcW w:type="dxa" w:w="2200"/>
             <w:shd w:val="clear" w:color="auto" w:fill="FFFFFF"/>
           </w:tcPr>
           <w:p>
@@ -2218,7 +2229,7 @@
         </w:tc>
         <w:tc>
           <w:tcPr>
-            <w:tcW w:type="dxa" w:w="5080"/>
+            <w:tcW w:type="dxa" w:w="4680"/>
             <w:shd w:val="clear" w:color="auto" w:fill="FFFFFF"/>
           </w:tcPr>
           <w:p>
@@ -2599,6 +2610,46 @@
 
 <file path=word/footer2.xml><?xml version="1.0" encoding="utf-8"?>
 <w:ftr xmlns:mc="http://schemas.openxmlformats.org/markup-compatibility/2006" xmlns:o="urn:schemas-microsoft-com:office:office" xmlns:r="http://schemas.openxmlformats.org/officeDocument/2006/relationships" xmlns:m="http://schemas.openxmlformats.org/officeDocument/2006/math" xmlns:v="urn:schemas-microsoft-com:vml" xmlns:wp="http://schemas.openxmlformats.org/drawingml/2006/wordprocessingDrawing" xmlns:w10="urn:schemas-microsoft-com:office:word" xmlns:w="http://schemas.openxmlformats.org/wordprocessingml/2006/main" xmlns:wne="http://schemas.microsoft.com/office/word/2006/wordml" xmlns:sl="http://schemas.openxmlformats.org/schemaLibrary/2006/main" xmlns:a="http://schemas.openxmlformats.org/drawingml/2006/main" xmlns:pic="http://schemas.openxmlformats.org/drawingml/2006/picture" xmlns:c="http://schemas.openxmlformats.org/drawingml/2006/chart" xmlns:lc="http://schemas.openxmlformats.org/drawingml/2006/lockedCanvas" xmlns:dgm="http://schemas.openxmlformats.org/drawingml/2006/diagram" xmlns:wps="http://schemas.microsoft.com/office/word/2010/wordprocessingShape" xmlns:wpg="http://schemas.microsoft.com/office/word/2010/wordprocessingGroup" xmlns:w14="http://schemas.microsoft.com/office/word/2010/wordml" xmlns:w15="http://schemas.microsoft.com/office/word/2012/wordml" xmlns:w16="http://schemas.microsoft.com/office/word/2018/wordml" xmlns:w16cex="http://schemas.microsoft.com/office/word/2018/wordml/cex" xmlns:w16cid="http://schemas.microsoft.com/office/word/2016/wordml/cid" xmlns="http://schemas.microsoft.com/office/tasks/2019/documenttasks" xmlns:cr="http://schemas.microsoft.com/office/comments/2020/reactions">
+  <w:p>
+    <w:pPr>
+      <w:spacing w:after="0"/>
+      <w:jc w:val="center"/>
+    </w:pPr>
+    <w:r>
+      <w:drawing>
+        <wp:inline>
+          <wp:extent cx="5943600" cy="798871"/>
+          <wp:docPr id="761037644" name="Picture 761037644"/>
+          <wp:cNvGraphicFramePr>
+            <a:graphicFrameLocks noChangeAspect="1"/>
+          </wp:cNvGraphicFramePr>
+          <a:graphic>
+            <a:graphicData uri="http://schemas.openxmlformats.org/drawingml/2006/picture">
+              <pic:pic>
+                <pic:nvPicPr>
+                  <pic:cNvPr id="0" name="cover_band.png"/>
+                  <pic:cNvPicPr/>
+                </pic:nvPicPr>
+                <pic:blipFill>
+                  <a:blip r:embed="rId2"/>
+                  <a:stretch>
+                    <a:fillRect/>
+                  </a:stretch>
+                </pic:blipFill>
+                <pic:spPr>
+                  <a:xfrm>
+                    <a:off x="0" y="0"/>
+                    <a:ext cx="5943600" cy="798871"/>
+                  </a:xfrm>
+                  <a:prstGeom prst="rect"/>
+                </pic:spPr>
+              </pic:pic>
+            </a:graphicData>
+          </a:graphic>
+        </wp:inline>
+      </w:drawing>
+    </w:r>
+  </w:p>
   <w:p>
     <w:pPr>
       <w:widowControl w:val="0"/>

</xml_diff>

<commit_message>
docs: rebuild the grant around the 47 lakh pilot-line budget
The equipment head is now the pilot line itself: a used 100 T moulder, three moulds, a stencil printer, a two-head PnP, a six-zone reflow and the test bench, itemised across 17 lines.

Heads: equipment 24,27,288, manpower 7,20,000, consumables 3,40,000, travel 1,00,000, misc 17,966, contingency 1,80,263, faculty 2,00,000, GST 7,17,393. Total 47,02,910, 94 percent of the ceiling.

Tranches follow the spend: 25,66,222 at T0, 16,23,623 at month 6, 5,13,065 at month 12. Milestone 1 becomes line procurement, and the proposal gains a 4.2 equipment breakdown; the workbook gains an Equipment sheet.

The C1 controller is an ESP8266, so the appendix and the specification no longer call it an ESP32.
</commit_message>
<xml_diff>
--- a/docs/office/TankGuard_Project_Proposal.docx
+++ b/docs/office/TankGuard_Project_Proposal.docx
@@ -366,6 +366,22 @@
         <w:t xml:space="preserve">     4.1  Supporting documentation</w:t>
         <w:tab/>
         <w:t>6</w:t>
+      </w:r>
+    </w:p>
+    <w:p>
+      <w:pPr>
+        <w:tabs>
+          <w:tab w:pos="8800" w:val="right" w:leader="dot"/>
+        </w:tabs>
+        <w:spacing w:after="80"/>
+      </w:pPr>
+      <w:r>
+        <w:rPr>
+          <w:sz w:val="22"/>
+        </w:rPr>
+        <w:t xml:space="preserve">     4.2  Equipment breakdown</w:t>
+        <w:tab/>
+        <w:t>7</w:t>
       </w:r>
     </w:p>
     <w:p>
@@ -1210,7 +1226,7 @@
               <w:rPr>
                 <w:sz w:val="19"/>
               </w:rPr>
-              <w:t>Design freeze and tooling</w:t>
+              <w:t>Design freeze and line procurement</w:t>
             </w:r>
           </w:p>
         </w:tc>
@@ -1240,7 +1256,7 @@
               <w:rPr>
                 <w:sz w:val="19"/>
               </w:rPr>
-              <w:t>Arm and enclosure frozen. Moulds ordered. Five pilot sets assembled. Certification scope agreed with the test laboratory.</w:t>
+              <w:t>Moulder, moulds, printer, PnP and reflow installed. Arm and enclosure frozen. Certification scope agreed with the test laboratory.</w:t>
             </w:r>
           </w:p>
         </w:tc>
@@ -1302,7 +1318,7 @@
               <w:rPr>
                 <w:sz w:val="19"/>
               </w:rPr>
-              <w:t>Twenty-five pilot sets built and calibrated against reference instruments. IP68 and EMC pre-compliance passed. Unit cost confirmed at INR 15,600 or below.</w:t>
+              <w:t>Twenty-five pilot sets built in-house and calibrated against reference instruments. IP68 and EMC pre-compliance passed. Unit cost confirmed.</w:t>
             </w:r>
           </w:p>
         </w:tc>
@@ -1497,7 +1513,7 @@
                 <w:color w:val="FFFFFF"/>
                 <w:sz w:val="19"/>
               </w:rPr>
-              <w:t>Amount (INR, incl. GST)</w:t>
+              <w:t>Amount (INR)</w:t>
             </w:r>
           </w:p>
         </w:tc>
@@ -1532,7 +1548,7 @@
               <w:rPr>
                 <w:sz w:val="19"/>
               </w:rPr>
-              <w:t>12,00,000</w:t>
+              <w:t>7,20,000</w:t>
             </w:r>
           </w:p>
         </w:tc>
@@ -1567,7 +1583,7 @@
               <w:rPr>
                 <w:sz w:val="19"/>
               </w:rPr>
-              <w:t>8,40,000</w:t>
+              <w:t>24,27,288</w:t>
             </w:r>
           </w:p>
         </w:tc>
@@ -1602,7 +1618,7 @@
               <w:rPr>
                 <w:sz w:val="19"/>
               </w:rPr>
-              <w:t>4,40,000</w:t>
+              <w:t>3,40,000</w:t>
             </w:r>
           </w:p>
         </w:tc>
@@ -1637,7 +1653,7 @@
               <w:rPr>
                 <w:sz w:val="19"/>
               </w:rPr>
-              <w:t>2,00,000</w:t>
+              <w:t>1,00,000</w:t>
             </w:r>
           </w:p>
         </w:tc>
@@ -1672,7 +1688,7 @@
               <w:rPr>
                 <w:sz w:val="19"/>
               </w:rPr>
-              <w:t>4,40,000</w:t>
+              <w:t>17,966</w:t>
             </w:r>
           </w:p>
         </w:tc>
@@ -1707,7 +1723,7 @@
               <w:rPr>
                 <w:sz w:val="19"/>
               </w:rPr>
-              <w:t>1,56,000</w:t>
+              <w:t>1,80,263</w:t>
             </w:r>
           </w:p>
         </w:tc>
@@ -1742,7 +1758,7 @@
               <w:rPr>
                 <w:sz w:val="19"/>
               </w:rPr>
-              <w:t>32,76,000</w:t>
+              <w:t>37,85,517</w:t>
             </w:r>
           </w:p>
         </w:tc>
@@ -1777,7 +1793,7 @@
               <w:rPr>
                 <w:sz w:val="19"/>
               </w:rPr>
-              <w:t>6,55,200</w:t>
+              <w:t>0</w:t>
             </w:r>
           </w:p>
         </w:tc>
@@ -1794,7 +1810,7 @@
               <w:rPr>
                 <w:sz w:val="19"/>
               </w:rPr>
-              <w:t>Faculty fee (max 20%)</w:t>
+              <w:t>Faculty fee</w:t>
             </w:r>
           </w:p>
         </w:tc>
@@ -1812,7 +1828,7 @@
               <w:rPr>
                 <w:sz w:val="19"/>
               </w:rPr>
-              <w:t>3,00,000</w:t>
+              <w:t>2,00,000</w:t>
             </w:r>
           </w:p>
         </w:tc>
@@ -1847,7 +1863,7 @@
               <w:rPr>
                 <w:sz w:val="19"/>
               </w:rPr>
-              <w:t>42,31,200</w:t>
+              <w:t>39,85,517</w:t>
             </w:r>
           </w:p>
         </w:tc>
@@ -1864,7 +1880,7 @@
               <w:rPr>
                 <w:sz w:val="19"/>
               </w:rPr>
-              <w:t>GST (18%, included)</w:t>
+              <w:t>GST (18%)</w:t>
             </w:r>
           </w:p>
         </w:tc>
@@ -1882,7 +1898,7 @@
               <w:rPr>
                 <w:sz w:val="19"/>
               </w:rPr>
-              <w:t>0</w:t>
+              <w:t>7,17,393</w:t>
             </w:r>
           </w:p>
         </w:tc>
@@ -1917,7 +1933,7 @@
               <w:rPr>
                 <w:sz w:val="19"/>
               </w:rPr>
-              <w:t>42,31,200</w:t>
+              <w:t>47,02,910</w:t>
             </w:r>
           </w:p>
         </w:tc>
@@ -1933,7 +1949,7 @@
           <w:b w:val="0"/>
           <w:sz w:val="20"/>
         </w:rPr>
-        <w:t>All figures are inclusive of GST at 18 percent. Manpower covers two full-time engineers at Nuke Labs for twelve months, one mechanical and one firmware, at INR 50,000 per month each. Equipment covers enclosure tooling (INR 4.0 lakh), a tank test rig (INR 2.0 lakh) and reference instruments for validation (INR 2.4 lakh). Consumables cover twenty-five pilot sets at INR 15,600 each, plus PCB fabrication and spares.</w:t>
+        <w:t>Equipment is the pilot line, itemised in the appendix: a used 100 T moulder, three moulds, a stencil printer, a two-head pick-and-place, a six-zone reflow, test fixtures and the bench. Manpower covers two engineers at Nuke Labs for twelve months. Consumables cover twenty-five pilot sets and PCB fabrication.</w:t>
       </w:r>
     </w:p>
     <w:p>
@@ -1945,7 +1961,7 @@
           <w:b w:val="0"/>
           <w:sz w:val="20"/>
         </w:rPr>
-        <w:t>Miscellaneous covers certification (INR 2.0 lakh), patent drafting and filing (INR 1.4 lakh), and market work with channel partners (INR 1.0 lakh). Travel covers the field installations and review meetings (INR 2.0 lakh). Contingency is 5 percent of direct cost and overhead 20 percent of the sub total; the faculty fee is INR 3.0 lakh, below the 20 percent cap.</w:t>
+        <w:t>Travel covers twelve field installations. Miscellaneous covers market work and small items; certification and the patent filing are carried by Nuke Labs. Contingency is 5 percent of direct cost and no overhead is claimed. The faculty fee is INR 2.0 lakh. GST at 18 percent is shown on the total.</w:t>
       </w:r>
     </w:p>
     <w:p>
@@ -1993,7 +2009,7 @@
         </w:trPr>
         <w:tc>
           <w:tcPr>
-            <w:tcW w:type="dxa" w:w="2200"/>
+            <w:tcW w:type="dxa" w:w="2400"/>
             <w:shd w:val="clear" w:color="auto" w:fill="1F4E79"/>
           </w:tcPr>
           <w:p>
@@ -2010,7 +2026,7 @@
         </w:tc>
         <w:tc>
           <w:tcPr>
-            <w:tcW w:type="dxa" w:w="2200"/>
+            <w:tcW w:type="dxa" w:w="2400"/>
             <w:shd w:val="clear" w:color="auto" w:fill="1F4E79"/>
           </w:tcPr>
           <w:p>
@@ -2027,7 +2043,7 @@
         </w:tc>
         <w:tc>
           <w:tcPr>
-            <w:tcW w:type="dxa" w:w="4680"/>
+            <w:tcW w:type="dxa" w:w="4280"/>
             <w:shd w:val="clear" w:color="auto" w:fill="1F4E79"/>
           </w:tcPr>
           <w:p>
@@ -2046,7 +2062,7 @@
       <w:tr>
         <w:tc>
           <w:tcPr>
-            <w:tcW w:type="dxa" w:w="2200"/>
+            <w:tcW w:type="dxa" w:w="2400"/>
             <w:shd w:val="clear" w:color="auto" w:fill="FFFFFF"/>
           </w:tcPr>
           <w:p>
@@ -2061,7 +2077,7 @@
         </w:tc>
         <w:tc>
           <w:tcPr>
-            <w:tcW w:type="dxa" w:w="2200"/>
+            <w:tcW w:type="dxa" w:w="2400"/>
             <w:shd w:val="clear" w:color="auto" w:fill="FFFFFF"/>
           </w:tcPr>
           <w:p>
@@ -2073,13 +2089,13 @@
               <w:rPr>
                 <w:sz w:val="19"/>
               </w:rPr>
-              <w:t>15,69,160</w:t>
-            </w:r>
-          </w:p>
-        </w:tc>
-        <w:tc>
-          <w:tcPr>
-            <w:tcW w:type="dxa" w:w="4680"/>
+              <w:t>25,66,222</w:t>
+            </w:r>
+          </w:p>
+        </w:tc>
+        <w:tc>
+          <w:tcPr>
+            <w:tcW w:type="dxa" w:w="4280"/>
             <w:shd w:val="clear" w:color="auto" w:fill="FFFFFF"/>
           </w:tcPr>
           <w:p>
@@ -2088,7 +2104,7 @@
               <w:rPr>
                 <w:sz w:val="19"/>
               </w:rPr>
-              <w:t>Design freeze, tooling and the first pilot sets</w:t>
+              <w:t>Line procurement, tooling and design freeze</w:t>
             </w:r>
           </w:p>
         </w:tc>
@@ -2096,7 +2112,7 @@
       <w:tr>
         <w:tc>
           <w:tcPr>
-            <w:tcW w:type="dxa" w:w="2200"/>
+            <w:tcW w:type="dxa" w:w="2400"/>
             <w:shd w:val="clear" w:color="auto" w:fill="FFFFFF"/>
           </w:tcPr>
           <w:p>
@@ -2111,7 +2127,7 @@
         </w:tc>
         <w:tc>
           <w:tcPr>
-            <w:tcW w:type="dxa" w:w="2200"/>
+            <w:tcW w:type="dxa" w:w="2400"/>
             <w:shd w:val="clear" w:color="auto" w:fill="FFFFFF"/>
           </w:tcPr>
           <w:p>
@@ -2123,13 +2139,13 @@
               <w:rPr>
                 <w:sz w:val="19"/>
               </w:rPr>
-              <w:t>16,39,560</w:t>
-            </w:r>
-          </w:p>
-        </w:tc>
-        <w:tc>
-          <w:tcPr>
-            <w:tcW w:type="dxa" w:w="4680"/>
+              <w:t>16,23,623</w:t>
+            </w:r>
+          </w:p>
+        </w:tc>
+        <w:tc>
+          <w:tcPr>
+            <w:tcW w:type="dxa" w:w="4280"/>
             <w:shd w:val="clear" w:color="auto" w:fill="FFFFFF"/>
           </w:tcPr>
           <w:p>
@@ -2146,7 +2162,7 @@
       <w:tr>
         <w:tc>
           <w:tcPr>
-            <w:tcW w:type="dxa" w:w="2200"/>
+            <w:tcW w:type="dxa" w:w="2400"/>
             <w:shd w:val="clear" w:color="auto" w:fill="FFFFFF"/>
           </w:tcPr>
           <w:p>
@@ -2161,7 +2177,7 @@
         </w:tc>
         <w:tc>
           <w:tcPr>
-            <w:tcW w:type="dxa" w:w="2200"/>
+            <w:tcW w:type="dxa" w:w="2400"/>
             <w:shd w:val="clear" w:color="auto" w:fill="FFFFFF"/>
           </w:tcPr>
           <w:p>
@@ -2173,13 +2189,13 @@
               <w:rPr>
                 <w:sz w:val="19"/>
               </w:rPr>
-              <w:t>10,22,480</w:t>
-            </w:r>
-          </w:p>
-        </w:tc>
-        <w:tc>
-          <w:tcPr>
-            <w:tcW w:type="dxa" w:w="4680"/>
+              <w:t>5,13,065</w:t>
+            </w:r>
+          </w:p>
+        </w:tc>
+        <w:tc>
+          <w:tcPr>
+            <w:tcW w:type="dxa" w:w="4280"/>
             <w:shd w:val="clear" w:color="auto" w:fill="FFFFFF"/>
           </w:tcPr>
           <w:p>
@@ -2196,7 +2212,7 @@
       <w:tr>
         <w:tc>
           <w:tcPr>
-            <w:tcW w:type="dxa" w:w="2200"/>
+            <w:tcW w:type="dxa" w:w="2400"/>
             <w:shd w:val="clear" w:color="auto" w:fill="FFFFFF"/>
           </w:tcPr>
           <w:p>
@@ -2211,7 +2227,7 @@
         </w:tc>
         <w:tc>
           <w:tcPr>
-            <w:tcW w:type="dxa" w:w="2200"/>
+            <w:tcW w:type="dxa" w:w="2400"/>
             <w:shd w:val="clear" w:color="auto" w:fill="FFFFFF"/>
           </w:tcPr>
           <w:p>
@@ -2223,13 +2239,13 @@
               <w:rPr>
                 <w:sz w:val="19"/>
               </w:rPr>
-              <w:t>42,31,200</w:t>
-            </w:r>
-          </w:p>
-        </w:tc>
-        <w:tc>
-          <w:tcPr>
-            <w:tcW w:type="dxa" w:w="4680"/>
+              <w:t>47,02,910</w:t>
+            </w:r>
+          </w:p>
+        </w:tc>
+        <w:tc>
+          <w:tcPr>
+            <w:tcW w:type="dxa" w:w="4280"/>
             <w:shd w:val="clear" w:color="auto" w:fill="FFFFFF"/>
           </w:tcPr>
           <w:p>
@@ -2351,7 +2367,7 @@
           <w:b w:val="0"/>
           <w:sz w:val="22"/>
         </w:rPr>
-        <w:t>The grant pays for the tooling, certification and pilot units that a first customer will not fund. Nuke Labs carries the channel, the service network and the field access.</w:t>
+        <w:t>The grant pays for the pilot line and the pilot units. Certification and the patent filing are carried by Nuke Labs, which also holds the channel and the service network.</w:t>
       </w:r>
     </w:p>
     <w:p>
@@ -2415,7 +2431,7 @@
           <w:b w:val="0"/>
           <w:sz w:val="22"/>
         </w:rPr>
-        <w:t>Firmware for all three units, compiling for ESP8266 (M1 and H1) and ESP32 (C1), with the React dashboard served from M1 flash.</w:t>
+        <w:t>Firmware for all three units, compiling for ESP8266 (M1, H1 and C1), with the React dashboard served from M1 flash.</w:t>
       </w:r>
     </w:p>
     <w:p>
@@ -2470,6 +2486,684 @@
         <w:t>Prototype spend to date: INR 23,587 in parts, with the monitor running at TRL 6.</w:t>
       </w:r>
     </w:p>
+    <w:p>
+      <w:pPr>
+        <w:pStyle w:val="Heading2"/>
+        <w:keepNext/>
+        <w:numPr>
+          <w:ilvl w:val="0"/>
+          <w:numId w:val="0"/>
+        </w:numPr>
+        <w:spacing w:before="200" w:after="120"/>
+      </w:pPr>
+      <w:r>
+        <w:rPr>
+          <w:b/>
+          <w:color w:val="2E74B5"/>
+          <w:sz w:val="25"/>
+        </w:rPr>
+        <w:t>4.2  Equipment breakdown</w:t>
+      </w:r>
+    </w:p>
+    <w:p>
+      <w:pPr>
+        <w:spacing w:after="120"/>
+      </w:pPr>
+      <w:r>
+        <w:rPr>
+          <w:b w:val="0"/>
+          <w:sz w:val="20"/>
+        </w:rPr>
+        <w:t>Pilot line, exclusive of GST. Figures are vendor quotes and negotiated targets at the time of writing.</w:t>
+      </w:r>
+    </w:p>
+    <w:tbl>
+      <w:tblPr>
+        <w:tblStyle w:val="TableGrid"/>
+        <w:tblW w:type="auto" w:w="0"/>
+        <w:jc w:val="center"/>
+        <w:tblLook w:firstColumn="1" w:firstRow="1" w:lastColumn="0" w:lastRow="0" w:noHBand="0" w:noVBand="1" w:val="04A0"/>
+      </w:tblPr>
+      <w:tblGrid>
+        <w:gridCol w:w="4819"/>
+        <w:gridCol w:w="4819"/>
+      </w:tblGrid>
+      <w:tr>
+        <w:trPr>
+          <w:tblHeader w:val="true"/>
+        </w:trPr>
+        <w:tc>
+          <w:tcPr>
+            <w:tcW w:type="dxa" w:w="6600"/>
+            <w:shd w:val="clear" w:color="auto" w:fill="1F4E79"/>
+          </w:tcPr>
+          <w:p>
+            <w:r/>
+            <w:r>
+              <w:rPr>
+                <w:b/>
+                <w:color w:val="FFFFFF"/>
+                <w:sz w:val="19"/>
+              </w:rPr>
+              <w:t>Equipment item</w:t>
+            </w:r>
+          </w:p>
+        </w:tc>
+        <w:tc>
+          <w:tcPr>
+            <w:tcW w:type="dxa" w:w="2480"/>
+            <w:shd w:val="clear" w:color="auto" w:fill="1F4E79"/>
+          </w:tcPr>
+          <w:p>
+            <w:r/>
+            <w:r>
+              <w:rPr>
+                <w:b/>
+                <w:color w:val="FFFFFF"/>
+                <w:sz w:val="19"/>
+              </w:rPr>
+              <w:t>Amount (INR)</w:t>
+            </w:r>
+          </w:p>
+        </w:tc>
+      </w:tr>
+      <w:tr>
+        <w:tc>
+          <w:tcPr>
+            <w:tcW w:type="dxa" w:w="6600"/>
+            <w:shd w:val="clear" w:color="auto" w:fill="FFFFFF"/>
+          </w:tcPr>
+          <w:p>
+            <w:r/>
+            <w:r>
+              <w:rPr>
+                <w:sz w:val="19"/>
+              </w:rPr>
+              <w:t>Used 100 T injection moulder</w:t>
+            </w:r>
+          </w:p>
+        </w:tc>
+        <w:tc>
+          <w:tcPr>
+            <w:tcW w:type="dxa" w:w="2480"/>
+            <w:shd w:val="clear" w:color="auto" w:fill="FFFFFF"/>
+          </w:tcPr>
+          <w:p>
+            <w:pPr>
+              <w:jc w:val="right"/>
+            </w:pPr>
+            <w:r/>
+            <w:r>
+              <w:rPr>
+                <w:sz w:val="19"/>
+              </w:rPr>
+              <w:t>4,50,000</w:t>
+            </w:r>
+          </w:p>
+        </w:tc>
+      </w:tr>
+      <w:tr>
+        <w:tc>
+          <w:tcPr>
+            <w:tcW w:type="dxa" w:w="6600"/>
+            <w:shd w:val="clear" w:color="auto" w:fill="FFFFFF"/>
+          </w:tcPr>
+          <w:p>
+            <w:r/>
+            <w:r>
+              <w:rPr>
+                <w:sz w:val="19"/>
+              </w:rPr>
+              <w:t>Three moulds (toolroom)</w:t>
+            </w:r>
+          </w:p>
+        </w:tc>
+        <w:tc>
+          <w:tcPr>
+            <w:tcW w:type="dxa" w:w="2480"/>
+            <w:shd w:val="clear" w:color="auto" w:fill="FFFFFF"/>
+          </w:tcPr>
+          <w:p>
+            <w:pPr>
+              <w:jc w:val="right"/>
+            </w:pPr>
+            <w:r/>
+            <w:r>
+              <w:rPr>
+                <w:sz w:val="19"/>
+              </w:rPr>
+              <w:t>3,50,000</w:t>
+            </w:r>
+          </w:p>
+        </w:tc>
+      </w:tr>
+      <w:tr>
+        <w:tc>
+          <w:tcPr>
+            <w:tcW w:type="dxa" w:w="6600"/>
+            <w:shd w:val="clear" w:color="auto" w:fill="FFFFFF"/>
+          </w:tcPr>
+          <w:p>
+            <w:r/>
+            <w:r>
+              <w:rPr>
+                <w:sz w:val="19"/>
+              </w:rPr>
+              <w:t>Chiller, dryer, granulator</w:t>
+            </w:r>
+          </w:p>
+        </w:tc>
+        <w:tc>
+          <w:tcPr>
+            <w:tcW w:type="dxa" w:w="2480"/>
+            <w:shd w:val="clear" w:color="auto" w:fill="FFFFFF"/>
+          </w:tcPr>
+          <w:p>
+            <w:pPr>
+              <w:jc w:val="right"/>
+            </w:pPr>
+            <w:r/>
+            <w:r>
+              <w:rPr>
+                <w:sz w:val="19"/>
+              </w:rPr>
+              <w:t>2,00,000</w:t>
+            </w:r>
+          </w:p>
+        </w:tc>
+      </w:tr>
+      <w:tr>
+        <w:tc>
+          <w:tcPr>
+            <w:tcW w:type="dxa" w:w="6600"/>
+            <w:shd w:val="clear" w:color="auto" w:fill="FFFFFF"/>
+          </w:tcPr>
+          <w:p>
+            <w:r/>
+            <w:r>
+              <w:rPr>
+                <w:sz w:val="19"/>
+              </w:rPr>
+              <w:t>Semi-auto stencil printer</w:t>
+            </w:r>
+          </w:p>
+        </w:tc>
+        <w:tc>
+          <w:tcPr>
+            <w:tcW w:type="dxa" w:w="2480"/>
+            <w:shd w:val="clear" w:color="auto" w:fill="FFFFFF"/>
+          </w:tcPr>
+          <w:p>
+            <w:pPr>
+              <w:jc w:val="right"/>
+            </w:pPr>
+            <w:r/>
+            <w:r>
+              <w:rPr>
+                <w:sz w:val="19"/>
+              </w:rPr>
+              <w:t>2,50,000</w:t>
+            </w:r>
+          </w:p>
+        </w:tc>
+      </w:tr>
+      <w:tr>
+        <w:tc>
+          <w:tcPr>
+            <w:tcW w:type="dxa" w:w="6600"/>
+            <w:shd w:val="clear" w:color="auto" w:fill="FFFFFF"/>
+          </w:tcPr>
+          <w:p>
+            <w:r/>
+            <w:r>
+              <w:rPr>
+                <w:sz w:val="19"/>
+              </w:rPr>
+              <w:t>Two-head vision pick-and-place</w:t>
+            </w:r>
+          </w:p>
+        </w:tc>
+        <w:tc>
+          <w:tcPr>
+            <w:tcW w:type="dxa" w:w="2480"/>
+            <w:shd w:val="clear" w:color="auto" w:fill="FFFFFF"/>
+          </w:tcPr>
+          <w:p>
+            <w:pPr>
+              <w:jc w:val="right"/>
+            </w:pPr>
+            <w:r/>
+            <w:r>
+              <w:rPr>
+                <w:sz w:val="19"/>
+              </w:rPr>
+              <w:t>3,10,000</w:t>
+            </w:r>
+          </w:p>
+        </w:tc>
+      </w:tr>
+      <w:tr>
+        <w:tc>
+          <w:tcPr>
+            <w:tcW w:type="dxa" w:w="6600"/>
+            <w:shd w:val="clear" w:color="auto" w:fill="FFFFFF"/>
+          </w:tcPr>
+          <w:p>
+            <w:r/>
+            <w:r>
+              <w:rPr>
+                <w:sz w:val="19"/>
+              </w:rPr>
+              <w:t>Six-zone reflow oven</w:t>
+            </w:r>
+          </w:p>
+        </w:tc>
+        <w:tc>
+          <w:tcPr>
+            <w:tcW w:type="dxa" w:w="2480"/>
+            <w:shd w:val="clear" w:color="auto" w:fill="FFFFFF"/>
+          </w:tcPr>
+          <w:p>
+            <w:pPr>
+              <w:jc w:val="right"/>
+            </w:pPr>
+            <w:r/>
+            <w:r>
+              <w:rPr>
+                <w:sz w:val="19"/>
+              </w:rPr>
+              <w:t>2,16,500</w:t>
+            </w:r>
+          </w:p>
+        </w:tc>
+      </w:tr>
+      <w:tr>
+        <w:tc>
+          <w:tcPr>
+            <w:tcW w:type="dxa" w:w="6600"/>
+            <w:shd w:val="clear" w:color="auto" w:fill="FFFFFF"/>
+          </w:tcPr>
+          <w:p>
+            <w:r/>
+            <w:r>
+              <w:rPr>
+                <w:sz w:val="19"/>
+              </w:rPr>
+              <w:t>Rework station</w:t>
+            </w:r>
+          </w:p>
+        </w:tc>
+        <w:tc>
+          <w:tcPr>
+            <w:tcW w:type="dxa" w:w="2480"/>
+            <w:shd w:val="clear" w:color="auto" w:fill="FFFFFF"/>
+          </w:tcPr>
+          <w:p>
+            <w:pPr>
+              <w:jc w:val="right"/>
+            </w:pPr>
+            <w:r/>
+            <w:r>
+              <w:rPr>
+                <w:sz w:val="19"/>
+              </w:rPr>
+              <w:t>20,000</w:t>
+            </w:r>
+          </w:p>
+        </w:tc>
+      </w:tr>
+      <w:tr>
+        <w:tc>
+          <w:tcPr>
+            <w:tcW w:type="dxa" w:w="6600"/>
+            <w:shd w:val="clear" w:color="auto" w:fill="FFFFFF"/>
+          </w:tcPr>
+          <w:p>
+            <w:r/>
+            <w:r>
+              <w:rPr>
+                <w:sz w:val="19"/>
+              </w:rPr>
+              <w:t>Stencils</w:t>
+            </w:r>
+          </w:p>
+        </w:tc>
+        <w:tc>
+          <w:tcPr>
+            <w:tcW w:type="dxa" w:w="2480"/>
+            <w:shd w:val="clear" w:color="auto" w:fill="FFFFFF"/>
+          </w:tcPr>
+          <w:p>
+            <w:pPr>
+              <w:jc w:val="right"/>
+            </w:pPr>
+            <w:r/>
+            <w:r>
+              <w:rPr>
+                <w:sz w:val="19"/>
+              </w:rPr>
+              <w:t>10,000</w:t>
+            </w:r>
+          </w:p>
+        </w:tc>
+      </w:tr>
+      <w:tr>
+        <w:tc>
+          <w:tcPr>
+            <w:tcW w:type="dxa" w:w="6600"/>
+            <w:shd w:val="clear" w:color="auto" w:fill="FFFFFF"/>
+          </w:tcPr>
+          <w:p>
+            <w:r/>
+            <w:r>
+              <w:rPr>
+                <w:sz w:val="19"/>
+              </w:rPr>
+              <w:t>Four ESD benches</w:t>
+            </w:r>
+          </w:p>
+        </w:tc>
+        <w:tc>
+          <w:tcPr>
+            <w:tcW w:type="dxa" w:w="2480"/>
+            <w:shd w:val="clear" w:color="auto" w:fill="FFFFFF"/>
+          </w:tcPr>
+          <w:p>
+            <w:pPr>
+              <w:jc w:val="right"/>
+            </w:pPr>
+            <w:r/>
+            <w:r>
+              <w:rPr>
+                <w:sz w:val="19"/>
+              </w:rPr>
+              <w:t>1,16,000</w:t>
+            </w:r>
+          </w:p>
+        </w:tc>
+      </w:tr>
+      <w:tr>
+        <w:tc>
+          <w:tcPr>
+            <w:tcW w:type="dxa" w:w="6600"/>
+            <w:shd w:val="clear" w:color="auto" w:fill="FFFFFF"/>
+          </w:tcPr>
+          <w:p>
+            <w:r/>
+            <w:r>
+              <w:rPr>
+                <w:sz w:val="19"/>
+              </w:rPr>
+              <w:t>Soldering stations and microscope</w:t>
+            </w:r>
+          </w:p>
+        </w:tc>
+        <w:tc>
+          <w:tcPr>
+            <w:tcW w:type="dxa" w:w="2480"/>
+            <w:shd w:val="clear" w:color="auto" w:fill="FFFFFF"/>
+          </w:tcPr>
+          <w:p>
+            <w:pPr>
+              <w:jc w:val="right"/>
+            </w:pPr>
+            <w:r/>
+            <w:r>
+              <w:rPr>
+                <w:sz w:val="19"/>
+              </w:rPr>
+              <w:t>48,000</w:t>
+            </w:r>
+          </w:p>
+        </w:tc>
+      </w:tr>
+      <w:tr>
+        <w:tc>
+          <w:tcPr>
+            <w:tcW w:type="dxa" w:w="6600"/>
+            <w:shd w:val="clear" w:color="auto" w:fill="FFFFFF"/>
+          </w:tcPr>
+          <w:p>
+            <w:r/>
+            <w:r>
+              <w:rPr>
+                <w:sz w:val="19"/>
+              </w:rPr>
+              <w:t>Oscilloscope, PSU, DMM</w:t>
+            </w:r>
+          </w:p>
+        </w:tc>
+        <w:tc>
+          <w:tcPr>
+            <w:tcW w:type="dxa" w:w="2480"/>
+            <w:shd w:val="clear" w:color="auto" w:fill="FFFFFF"/>
+          </w:tcPr>
+          <w:p>
+            <w:pPr>
+              <w:jc w:val="right"/>
+            </w:pPr>
+            <w:r/>
+            <w:r>
+              <w:rPr>
+                <w:sz w:val="19"/>
+              </w:rPr>
+              <w:t>27,000</w:t>
+            </w:r>
+          </w:p>
+        </w:tc>
+      </w:tr>
+      <w:tr>
+        <w:tc>
+          <w:tcPr>
+            <w:tcW w:type="dxa" w:w="6600"/>
+            <w:shd w:val="clear" w:color="auto" w:fill="FFFFFF"/>
+          </w:tcPr>
+          <w:p>
+            <w:r/>
+            <w:r>
+              <w:rPr>
+                <w:sz w:val="19"/>
+              </w:rPr>
+              <w:t>Functional-test fixtures</w:t>
+            </w:r>
+          </w:p>
+        </w:tc>
+        <w:tc>
+          <w:tcPr>
+            <w:tcW w:type="dxa" w:w="2480"/>
+            <w:shd w:val="clear" w:color="auto" w:fill="FFFFFF"/>
+          </w:tcPr>
+          <w:p>
+            <w:pPr>
+              <w:jc w:val="right"/>
+            </w:pPr>
+            <w:r/>
+            <w:r>
+              <w:rPr>
+                <w:sz w:val="19"/>
+              </w:rPr>
+              <w:t>1,50,000</w:t>
+            </w:r>
+          </w:p>
+        </w:tc>
+      </w:tr>
+      <w:tr>
+        <w:tc>
+          <w:tcPr>
+            <w:tcW w:type="dxa" w:w="6600"/>
+            <w:shd w:val="clear" w:color="auto" w:fill="FFFFFF"/>
+          </w:tcPr>
+          <w:p>
+            <w:r/>
+            <w:r>
+              <w:rPr>
+                <w:sz w:val="19"/>
+              </w:rPr>
+              <w:t>Calibration</w:t>
+            </w:r>
+          </w:p>
+        </w:tc>
+        <w:tc>
+          <w:tcPr>
+            <w:tcW w:type="dxa" w:w="2480"/>
+            <w:shd w:val="clear" w:color="auto" w:fill="FFFFFF"/>
+          </w:tcPr>
+          <w:p>
+            <w:pPr>
+              <w:jc w:val="right"/>
+            </w:pPr>
+            <w:r/>
+            <w:r>
+              <w:rPr>
+                <w:sz w:val="19"/>
+              </w:rPr>
+              <w:t>40,000</w:t>
+            </w:r>
+          </w:p>
+        </w:tc>
+      </w:tr>
+      <w:tr>
+        <w:tc>
+          <w:tcPr>
+            <w:tcW w:type="dxa" w:w="6600"/>
+            <w:shd w:val="clear" w:color="auto" w:fill="FFFFFF"/>
+          </w:tcPr>
+          <w:p>
+            <w:r/>
+            <w:r>
+              <w:rPr>
+                <w:sz w:val="19"/>
+              </w:rPr>
+              <w:t>Hand tools, crimpers, bench consumables</w:t>
+            </w:r>
+          </w:p>
+        </w:tc>
+        <w:tc>
+          <w:tcPr>
+            <w:tcW w:type="dxa" w:w="2480"/>
+            <w:shd w:val="clear" w:color="auto" w:fill="FFFFFF"/>
+          </w:tcPr>
+          <w:p>
+            <w:pPr>
+              <w:jc w:val="right"/>
+            </w:pPr>
+            <w:r/>
+            <w:r>
+              <w:rPr>
+                <w:sz w:val="19"/>
+              </w:rPr>
+              <w:t>39,788</w:t>
+            </w:r>
+          </w:p>
+        </w:tc>
+      </w:tr>
+      <w:tr>
+        <w:tc>
+          <w:tcPr>
+            <w:tcW w:type="dxa" w:w="6600"/>
+            <w:shd w:val="clear" w:color="auto" w:fill="FFFFFF"/>
+          </w:tcPr>
+          <w:p>
+            <w:r/>
+            <w:r>
+              <w:rPr>
+                <w:sz w:val="19"/>
+              </w:rPr>
+              <w:t>Electrical, air, fume, fire</w:t>
+            </w:r>
+          </w:p>
+        </w:tc>
+        <w:tc>
+          <w:tcPr>
+            <w:tcW w:type="dxa" w:w="2480"/>
+            <w:shd w:val="clear" w:color="auto" w:fill="FFFFFF"/>
+          </w:tcPr>
+          <w:p>
+            <w:pPr>
+              <w:jc w:val="right"/>
+            </w:pPr>
+            <w:r/>
+            <w:r>
+              <w:rPr>
+                <w:sz w:val="19"/>
+              </w:rPr>
+              <w:t>1,20,000</w:t>
+            </w:r>
+          </w:p>
+        </w:tc>
+      </w:tr>
+      <w:tr>
+        <w:tc>
+          <w:tcPr>
+            <w:tcW w:type="dxa" w:w="6600"/>
+            <w:shd w:val="clear" w:color="auto" w:fill="FFFFFF"/>
+          </w:tcPr>
+          <w:p>
+            <w:r/>
+            <w:r>
+              <w:rPr>
+                <w:sz w:val="19"/>
+              </w:rPr>
+              <w:t>Freight and installation</w:t>
+            </w:r>
+          </w:p>
+        </w:tc>
+        <w:tc>
+          <w:tcPr>
+            <w:tcW w:type="dxa" w:w="2480"/>
+            <w:shd w:val="clear" w:color="auto" w:fill="FFFFFF"/>
+          </w:tcPr>
+          <w:p>
+            <w:pPr>
+              <w:jc w:val="right"/>
+            </w:pPr>
+            <w:r/>
+            <w:r>
+              <w:rPr>
+                <w:sz w:val="19"/>
+              </w:rPr>
+              <w:t>80,000</w:t>
+            </w:r>
+          </w:p>
+        </w:tc>
+      </w:tr>
+      <w:tr>
+        <w:tc>
+          <w:tcPr>
+            <w:tcW w:type="dxa" w:w="6600"/>
+            <w:shd w:val="clear" w:color="auto" w:fill="FFFFFF"/>
+          </w:tcPr>
+          <w:p>
+            <w:r/>
+            <w:r>
+              <w:rPr>
+                <w:sz w:val="19"/>
+              </w:rPr>
+              <w:t>Equipment total</w:t>
+            </w:r>
+          </w:p>
+        </w:tc>
+        <w:tc>
+          <w:tcPr>
+            <w:tcW w:type="dxa" w:w="2480"/>
+            <w:shd w:val="clear" w:color="auto" w:fill="FFFFFF"/>
+          </w:tcPr>
+          <w:p>
+            <w:pPr>
+              <w:jc w:val="right"/>
+            </w:pPr>
+            <w:r/>
+            <w:r>
+              <w:rPr>
+                <w:sz w:val="19"/>
+              </w:rPr>
+              <w:t>24,27,288</w:t>
+            </w:r>
+          </w:p>
+        </w:tc>
+      </w:tr>
+    </w:tbl>
+    <w:p/>
     <w:sectPr>
       <w:headerReference r:id="rId11" w:type="default"/>
       <w:headerReference r:id="rId12" w:type="first"/>

</xml_diff>

<commit_message>
docs: drop the patent filing from the deliverables
The programme asks that IP arising from the grant be reported to TIH and is jointly owned; it does not require a filing. The promise is removed from the objectives, deliverables, milestone 4, the commercialisation note, the deck and the tranche labels.

The prior-art disclosure stays in the appendix as a supporting document.
</commit_message>
<xml_diff>
--- a/docs/office/TankGuard_Project_Proposal.docx
+++ b/docs/office/TankGuard_Project_Proposal.docx
@@ -792,7 +792,7 @@
           <w:b w:val="0"/>
           <w:sz w:val="22"/>
         </w:rPr>
-        <w:t>The monitoring prototype is built. The M1 firmware, the dashboard and the path planner run, and INR 23,587 of parts have already been invested. The grant funds the step from that prototype to a certified product: the arm hardware, twenty-five pilot units, certification, a patent and twelve field installations.</w:t>
+        <w:t>The monitoring prototype is built. The M1 firmware, the dashboard and the path planner run, and INR 23,587 of parts have already been invested. The grant funds the step from that prototype to a certified product: the arm hardware, twenty-five pilot units, certification and twelve field installations.</w:t>
       </w:r>
     </w:p>
     <w:p>
@@ -804,7 +804,7 @@
           <w:b w:val="0"/>
           <w:sz w:val="22"/>
         </w:rPr>
-        <w:t>The project delivers a production revision of M1 and H1, twenty-five pilot units of the C1 cleaning arm, twelve field installations, certification, a filed patent, and three paying pilot customers. The target is TRL 8, with the unit cost and the service model proven before the first production run.</w:t>
+        <w:t>The project delivers a production revision of M1 and H1, twenty-five pilot units of the C1 cleaning arm, twelve field installations, certification, and three paying pilot customers. The target is TRL 8, with the unit cost and the service model proven before the first production run.</w:t>
       </w:r>
     </w:p>
     <w:p>
@@ -1012,7 +1012,7 @@
           <w:b w:val="0"/>
           <w:sz w:val="22"/>
         </w:rPr>
-        <w:t>Objective 4: prove it in the field and take it to market. The monitor enters at TRL 6 and the arm at TRL 4; twelve months later the system is at TRL 8, with twenty-five pilot units, twelve installations, certification, a filed patent and three paying customers.</w:t>
+        <w:t>Objective 4: prove it in the field and take it to market. The monitor enters at TRL 6 and the arm at TRL 4; twelve months later the system is at TRL 8, with twenty-five pilot units, twelve installations, certification and three paying customers.</w:t>
       </w:r>
     </w:p>
     <w:p>
@@ -1079,7 +1079,7 @@
           <w:b w:val="0"/>
           <w:sz w:val="22"/>
         </w:rPr>
-        <w:t>D4. Commercial pack: twelve installations, certification and patent filed, three paying pilot customers, a channel agreement, and the TRL 8 evidence set.</w:t>
+        <w:t>D4. Commercial pack: twelve installations, certification filed, three paying pilot customers, a channel agreement, and the TRL 8 evidence set.</w:t>
       </w:r>
     </w:p>
     <w:p>
@@ -1442,7 +1442,7 @@
               <w:rPr>
                 <w:sz w:val="19"/>
               </w:rPr>
-              <w:t>Certification filed, patent filed, three paying pilot customers, channel agreement signed, TRL 8 evidence pack.</w:t>
+              <w:t>Certification filed, three paying pilot customers, channel agreement signed, TRL 8 evidence pack.</w:t>
             </w:r>
           </w:p>
         </w:tc>
@@ -1961,7 +1961,7 @@
           <w:b w:val="0"/>
           <w:sz w:val="20"/>
         </w:rPr>
-        <w:t>Travel covers twelve field installations. Miscellaneous covers market work and small items; certification and the patent filing are carried by Nuke Labs. Contingency is 5 percent of direct cost and no overhead is claimed. The faculty fee is INR 2.0 lakh. GST at 18 percent is shown on the total.</w:t>
+        <w:t>Travel covers twelve field installations. Miscellaneous covers market work and small items; certification is carried by Nuke Labs. Contingency is 5 percent of direct cost and no overhead is claimed. The faculty fee is INR 2.0 lakh. GST at 18 percent is shown on the total.</w:t>
       </w:r>
     </w:p>
     <w:p>
@@ -2204,7 +2204,7 @@
               <w:rPr>
                 <w:sz w:val="19"/>
               </w:rPr>
-              <w:t>Validation close-out, IP filing and commercial launch</w:t>
+              <w:t>Validation close-out, certification and commercial launch</w:t>
             </w:r>
           </w:p>
         </w:tc>
@@ -2367,7 +2367,7 @@
           <w:b w:val="0"/>
           <w:sz w:val="22"/>
         </w:rPr>
-        <w:t>The grant pays for the pilot line and the pilot units. Certification and the patent filing are carried by Nuke Labs, which also holds the channel and the service network.</w:t>
+        <w:t>The grant pays for the pilot line and the pilot units. Certification is carried by Nuke Labs, which also holds the channel and the service network.</w:t>
       </w:r>
     </w:p>
     <w:p>

</xml_diff>

<commit_message>
docs: record TRL 7 for the arm and add the tank-test evidence note
Both joints were driven in a real 500 L tank on 31 October 2026, which is the TRL 7 definition used by the call: the technology works in a real place.

The claim is scoped to the arm's drive, structure and manual control. The autonomous cycle, brush and pump under sludge, and coverage remain project deliverables, which is what separates TRL 7 from TRL 8.

Adds TG-TRL-2026-001 (markdown, HTML and PDF) and updates the executive summary, objective 4, the appendix, and slides 7, 12 and 13.
</commit_message>
<xml_diff>
--- a/docs/office/TankGuard_Project_Proposal.docx
+++ b/docs/office/TankGuard_Project_Proposal.docx
@@ -804,7 +804,7 @@
           <w:b w:val="0"/>
           <w:sz w:val="22"/>
         </w:rPr>
-        <w:t>The project delivers a production revision of M1 and H1, twenty-five pilot units of the C1 cleaning arm, twelve field installations, certification, and three paying pilot customers. The target is TRL 8, with the unit cost and the service model proven before the first production run.</w:t>
+        <w:t>The project delivers a production revision of M1 and H1, twenty-five pilot units of the C1 cleaning arm, twelve field installations, certification, and three paying pilot customers. The arm has already reached TRL 7: both joints ran in a real 500 L tank. The project takes the integrated system to TRL 8, with the unit cost and the service model proven before the first production run.</w:t>
       </w:r>
     </w:p>
     <w:p>
@@ -1012,7 +1012,7 @@
           <w:b w:val="0"/>
           <w:sz w:val="22"/>
         </w:rPr>
-        <w:t>Objective 4: prove it in the field and take it to market. The monitor enters at TRL 6 and the arm at TRL 4; twelve months later the system is at TRL 8, with twenty-five pilot units, twelve installations, certification and three paying customers.</w:t>
+        <w:t>Objective 4: prove it in the field and take it to market. The arm has reached TRL 7 in a real 500 L tank; the monitor is at TRL 6. Twelve months later the integrated system is at TRL 8, with twenty-five pilot units, twelve installations, certification and three paying customers.</w:t>
       </w:r>
     </w:p>
     <w:p>
@@ -1942,44 +1942,31 @@
     <w:p/>
     <w:p>
       <w:pPr>
-        <w:spacing w:after="120"/>
+        <w:spacing w:after="80"/>
       </w:pPr>
       <w:r>
         <w:rPr>
           <w:b w:val="0"/>
-          <w:sz w:val="20"/>
+          <w:sz w:val="19"/>
         </w:rPr>
-        <w:t>Equipment is the pilot line, itemised in the appendix: a used 100 T moulder, three moulds, a stencil printer, a two-head pick-and-place, a six-zone reflow, test fixtures and the bench. Manpower covers two engineers at Nuke Labs for twelve months. Consumables cover twenty-five pilot sets and PCB fabrication.</w:t>
+        <w:t>Equipment is the pilot line, itemised in the appendix: moulder, moulds, stencil printer, pick-and-place, reflow, fixtures and bench. Manpower covers two engineers at Nuke Labs for twelve months. Consumables cover twenty-five pilot sets and PCB fabrication.</w:t>
       </w:r>
     </w:p>
     <w:p>
       <w:pPr>
-        <w:spacing w:after="120"/>
+        <w:spacing w:after="80"/>
       </w:pPr>
       <w:r>
         <w:rPr>
           <w:b w:val="0"/>
-          <w:sz w:val="20"/>
+          <w:sz w:val="19"/>
         </w:rPr>
-        <w:t>Travel covers twelve field installations. Miscellaneous covers market work and small items; certification is carried by Nuke Labs. Contingency is 5 percent of direct cost and no overhead is claimed. The faculty fee is INR 2.0 lakh. GST at 18 percent is shown on the total.</w:t>
+        <w:t>Travel covers twelve field installations. Miscellaneous covers market work and small items; certification is carried by Nuke Labs. Contingency is 5 percent of direct cost, no overhead is claimed, and GST at 18 percent is shown on the total. Prototype parts to date total INR 23,587, already invested and not part of this request.</w:t>
       </w:r>
     </w:p>
     <w:p>
       <w:pPr>
-        <w:spacing w:after="120"/>
-      </w:pPr>
-      <w:r>
-        <w:rPr>
-          <w:b w:val="0"/>
-          <w:sz w:val="20"/>
-        </w:rPr>
-        <w:t>Prototype parts to date total INR 23,587, already invested and not part of this request.</w:t>
-      </w:r>
-    </w:p>
-    <w:p>
-      <w:pPr>
         <w:keepNext/>
-        <w:pageBreakBefore/>
         <w:spacing w:after="120" w:before="280"/>
       </w:pPr>
       <w:r>
@@ -2458,6 +2445,19 @@
           <w:sz w:val="22"/>
         </w:rPr>
         <w:t>Coverage planner (tools/swept_area.html) and the generated path used by the controller (firmware/c1_cleaner/path.h).</w:t>
+      </w:r>
+    </w:p>
+    <w:p>
+      <w:pPr>
+        <w:spacing w:after="80"/>
+        <w:ind w:left="280"/>
+      </w:pPr>
+      <w:r>
+        <w:rPr>
+          <w:b w:val="0"/>
+          <w:sz w:val="22"/>
+        </w:rPr>
+        <w:t>TRL 7 evidence note (TG-TRL-2026-001), October 2026, covering the 500 L tank test.</w:t>
       </w:r>
     </w:p>
     <w:p>

</xml_diff>